<commit_message>
Diagnóstico 360° Pro: capa com fundo ancorado à página
A capa usava uma tabela a toda a largura numa secção sem margens, que
alguns leitores deslocam para a esquerda. Passa a usar uma imagem de
fundo ancorada à página (atrás do texto) e o conteúdo dentro das
margens normais.

Co-Authored-By: Claude Opus 5.5 <noreply@anthropic.com>
Claude-Session: https://claude.ai/code/session_01NnbiwV4Fqx4dXT646nXdSp
</commit_message>
<xml_diff>
--- a/midiapro/diagnostico-360/Diagnostico_360_Pro_Briefing_Home_Center.docx
+++ b/midiapro/diagnostico-360/Diagnostico_360_Pro_Briefing_Home_Center.docx
@@ -2,9 +2,176 @@
 <file path=word/document.xml><?xml version="1.0" encoding="utf-8"?>
 <w:document xmlns:wpc="http://schemas.microsoft.com/office/word/2010/wordprocessingCanvas" xmlns:mc="http://schemas.openxmlformats.org/markup-compatibility/2006" xmlns:o="urn:schemas-microsoft-com:office:office" xmlns:r="http://schemas.openxmlformats.org/officeDocument/2006/relationships" xmlns:m="http://schemas.openxmlformats.org/officeDocument/2006/math" xmlns:v="urn:schemas-microsoft-com:vml" xmlns:wp14="http://schemas.microsoft.com/office/word/2010/wordprocessingDrawing" xmlns:wp="http://schemas.openxmlformats.org/drawingml/2006/wordprocessingDrawing" xmlns:w10="urn:schemas-microsoft-com:office:word" xmlns:w="http://schemas.openxmlformats.org/wordprocessingml/2006/main" xmlns:w14="http://schemas.microsoft.com/office/word/2010/wordml" xmlns:w15="http://schemas.microsoft.com/office/word/2012/wordml" xmlns:wpg="http://schemas.microsoft.com/office/word/2010/wordprocessingGroup" xmlns:wpi="http://schemas.microsoft.com/office/word/2010/wordprocessingInk" xmlns:wne="http://schemas.microsoft.com/office/word/2006/wordml" xmlns:wps="http://schemas.microsoft.com/office/word/2010/wordprocessingShape" xmlns:cx="http://schemas.microsoft.com/office/drawing/2014/chartex" xmlns:cx1="http://schemas.microsoft.com/office/drawing/2015/9/8/chartex" xmlns:cx2="http://schemas.microsoft.com/office/drawing/2015/10/21/chartex" xmlns:cx3="http://schemas.microsoft.com/office/drawing/2016/5/9/chartex" xmlns:cx4="http://schemas.microsoft.com/office/drawing/2016/5/10/chartex" xmlns:cx5="http://schemas.microsoft.com/office/drawing/2016/5/11/chartex" xmlns:cx6="http://schemas.microsoft.com/office/drawing/2016/5/12/chartex" xmlns:cx7="http://schemas.microsoft.com/office/drawing/2016/5/13/chartex" xmlns:cx8="http://schemas.microsoft.com/office/drawing/2016/5/14/chartex" xmlns:aink="http://schemas.microsoft.com/office/drawing/2016/ink" xmlns:am3d="http://schemas.microsoft.com/office/drawing/2017/model3d" xmlns:w16cex="http://schemas.microsoft.com/office/word/2018/wordml/cex" xmlns:w16cid="http://schemas.microsoft.com/office/word/2016/wordml/cid" xmlns:w16="http://schemas.microsoft.com/office/word/2018/wordml" xmlns:w16sdtdh="http://schemas.microsoft.com/office/word/2020/wordml/sdtdatahash" xmlns:w16se="http://schemas.microsoft.com/office/word/2015/wordml/symex" mc:Ignorable="w14 w15 wp14">
   <w:body>
+    <w:p>
+      <w:pPr>
+        <w:spacing w:after="0" w:before="0"/>
+      </w:pPr>
+      <w:r>
+        <w:drawing>
+          <wp:anchor distT="0" distB="0" distL="0" distR="0" simplePos="0" allowOverlap="1" behindDoc="1" locked="1" layoutInCell="1" relativeHeight="10696575">
+            <wp:simplePos x="0" y="0"/>
+            <wp:positionH relativeFrom="page">
+              <wp:posOffset>0</wp:posOffset>
+            </wp:positionH>
+            <wp:positionV relativeFrom="page">
+              <wp:posOffset>0</wp:posOffset>
+            </wp:positionV>
+            <wp:extent cx="7562850" cy="10696575"/>
+            <wp:effectExtent t="0" r="0" b="0" l="0"/>
+            <wp:wrapNone/>
+            <wp:docPr id="1" name="" descr="" title=""/>
+            <wp:cNvGraphicFramePr>
+              <a:graphicFrameLocks xmlns:a="http://schemas.openxmlformats.org/drawingml/2006/main" noChangeAspect="1"/>
+            </wp:cNvGraphicFramePr>
+            <a:graphic xmlns:a="http://schemas.openxmlformats.org/drawingml/2006/main">
+              <a:graphicData uri="http://schemas.openxmlformats.org/drawingml/2006/picture">
+                <pic:pic xmlns:pic="http://schemas.openxmlformats.org/drawingml/2006/picture">
+                  <pic:nvPicPr>
+                    <pic:cNvPr id="0" name="" descr=""/>
+                    <pic:cNvPicPr>
+                      <a:picLocks noChangeAspect="1" noChangeArrowheads="1"/>
+                    </pic:cNvPicPr>
+                  </pic:nvPicPr>
+                  <pic:blipFill>
+                    <a:blip r:embed="rId9" cstate="none"/>
+                    <a:srcRect/>
+                    <a:stretch>
+                      <a:fillRect/>
+                    </a:stretch>
+                  </pic:blipFill>
+                  <pic:spPr bwMode="auto">
+                    <a:xfrm>
+                      <a:off x="0" y="0"/>
+                      <a:ext cx="7562850" cy="10696575"/>
+                    </a:xfrm>
+                    <a:prstGeom prst="rect">
+                      <a:avLst/>
+                    </a:prstGeom>
+                  </pic:spPr>
+                </pic:pic>
+              </a:graphicData>
+            </a:graphic>
+          </wp:anchor>
+        </w:drawing>
+      </w:r>
+      <w:r>
+        <w:drawing>
+          <wp:inline distT="0" distB="0" distL="0" distR="0">
+            <wp:extent cx="1809750" cy="1104900"/>
+            <wp:effectExtent t="0" r="0" b="0" l="0"/>
+            <wp:docPr id="1" name="" descr="" title=""/>
+            <wp:cNvGraphicFramePr>
+              <a:graphicFrameLocks xmlns:a="http://schemas.openxmlformats.org/drawingml/2006/main" noChangeAspect="1"/>
+            </wp:cNvGraphicFramePr>
+            <a:graphic xmlns:a="http://schemas.openxmlformats.org/drawingml/2006/main">
+              <a:graphicData uri="http://schemas.openxmlformats.org/drawingml/2006/picture">
+                <pic:pic xmlns:pic="http://schemas.openxmlformats.org/drawingml/2006/picture">
+                  <pic:nvPicPr>
+                    <pic:cNvPr id="0" name="" descr=""/>
+                    <pic:cNvPicPr>
+                      <a:picLocks noChangeAspect="1" noChangeArrowheads="1"/>
+                    </pic:cNvPicPr>
+                  </pic:nvPicPr>
+                  <pic:blipFill>
+                    <a:blip r:embed="rId10" cstate="none"/>
+                    <a:srcRect/>
+                    <a:stretch>
+                      <a:fillRect/>
+                    </a:stretch>
+                  </pic:blipFill>
+                  <pic:spPr bwMode="auto">
+                    <a:xfrm>
+                      <a:off x="0" y="0"/>
+                      <a:ext cx="1809750" cy="1104900"/>
+                    </a:xfrm>
+                    <a:prstGeom prst="rect">
+                      <a:avLst/>
+                    </a:prstGeom>
+                  </pic:spPr>
+                </pic:pic>
+              </a:graphicData>
+            </a:graphic>
+          </wp:inline>
+        </w:drawing>
+      </w:r>
+    </w:p>
+    <w:p>
+      <w:pPr>
+        <w:spacing w:after="0" w:before="0" w:line="2400" w:lineRule="exact"/>
+      </w:pPr>
+    </w:p>
+    <w:p>
+      <w:pPr>
+        <w:keepLines/>
+        <w:spacing w:after="160" w:before="0" w:line="276" w:lineRule="auto"/>
+      </w:pPr>
+      <w:r>
+        <w:rPr>
+          <w:rFonts w:ascii="Google Sans" w:cs="Google Sans" w:eastAsia="Google Sans" w:hAnsi="Google Sans"/>
+          <w:b/>
+          <w:bCs/>
+          <w:caps/>
+          <w:color w:val="9DB2FF"/>
+          <w:spacing w:val="40"/>
+          <w:sz w:val="20"/>
+          <w:szCs w:val="20"/>
+        </w:rPr>
+        <w:t xml:space="preserve">Briefing Estratégico &amp; Diagnóstico de Liderança</w:t>
+      </w:r>
+    </w:p>
+    <w:p>
+      <w:pPr>
+        <w:keepLines/>
+        <w:spacing w:after="0" w:before="0" w:line="240" w:lineRule="auto"/>
+      </w:pPr>
+      <w:r>
+        <w:rPr>
+          <w:rFonts w:ascii="Google Sans" w:cs="Google Sans" w:eastAsia="Google Sans" w:hAnsi="Google Sans"/>
+          <w:b/>
+          <w:bCs/>
+          <w:color w:val="FFFFFF"/>
+          <w:sz w:val="84"/>
+          <w:szCs w:val="84"/>
+        </w:rPr>
+        <w:t xml:space="preserve">Diagnóstico</w:t>
+      </w:r>
+    </w:p>
+    <w:p>
+      <w:pPr>
+        <w:keepLines/>
+        <w:spacing w:after="240" w:before="0" w:line="240" w:lineRule="auto"/>
+      </w:pPr>
+      <w:r>
+        <w:rPr>
+          <w:rFonts w:ascii="Google Sans" w:cs="Google Sans" w:eastAsia="Google Sans" w:hAnsi="Google Sans"/>
+          <w:b/>
+          <w:bCs/>
+          <w:color w:val="FFFFFF"/>
+          <w:sz w:val="84"/>
+          <w:szCs w:val="84"/>
+        </w:rPr>
+        <w:t xml:space="preserve">360° Pro</w:t>
+      </w:r>
+    </w:p>
+    <w:p>
+      <w:pPr>
+        <w:keepLines/>
+        <w:spacing w:after="480" w:before="0" w:line="320" w:lineRule="auto"/>
+      </w:pPr>
+      <w:r>
+        <w:rPr>
+          <w:rFonts w:ascii="Google Sans" w:cs="Google Sans" w:eastAsia="Google Sans" w:hAnsi="Google Sans"/>
+          <w:color w:val="D7DEFF"/>
+          <w:sz w:val="24"/>
+          <w:szCs w:val="24"/>
+        </w:rPr>
+        <w:t xml:space="preserve">Guia e formulário de recolha da informação fundamental para a construção da estratégia completa da empresa cliente.</w:t>
+      </w:r>
+    </w:p>
     <w:tbl>
       <w:tblPr>
-        <w:tblW w:type="dxa" w:w="11906"/>
+        <w:tblW w:type="dxa" w:w="9306"/>
+        <w:tblInd w:type="dxa" w:w="0"/>
         <w:tblBorders>
           <w:top w:val="none" w:color="FFFFFF" w:sz="0"/>
           <w:left w:val="none" w:color="FFFFFF" w:sz="0"/>
@@ -16,90 +183,34 @@
         <w:tblLayout w:type="fixed"/>
       </w:tblPr>
       <w:tblGrid>
-        <w:gridCol w:w="11906"/>
+        <w:gridCol w:w="1700"/>
+        <w:gridCol w:w="7606"/>
       </w:tblGrid>
       <w:tr>
         <w:trPr>
           <w:cantSplit/>
-          <w:trHeight w:val="16798" w:hRule="exact"/>
         </w:trPr>
         <w:tc>
           <w:tcPr>
-            <w:tcW w:type="dxa" w:w="11906"/>
-            <w:tcBorders>
-              <w:top w:val="single" w:color="000C3E" w:sz="4"/>
-              <w:left w:val="single" w:color="000C3E" w:sz="4"/>
-              <w:bottom w:val="single" w:color="000C3E" w:sz="4"/>
-              <w:right w:val="single" w:color="000C3E" w:sz="4"/>
-            </w:tcBorders>
-            <w:shd w:fill="000C3E" w:color="auto" w:val="clear"/>
-            <w:tcMar>
-              <w:top w:type="dxa" w:w="0"/>
-              <w:left w:type="dxa" w:w="1300"/>
-              <w:bottom w:type="dxa" w:w="0"/>
-              <w:right w:type="dxa" w:w="1300"/>
-            </w:tcMar>
-            <w:vAlign w:val="top"/>
-          </w:tcPr>
-          <w:p>
-            <w:pPr>
-              <w:spacing w:after="0" w:before="0" w:line="900" w:lineRule="exact"/>
-            </w:pPr>
-          </w:p>
-          <w:p>
-            <w:pPr>
-              <w:spacing w:after="0"/>
-            </w:pPr>
-            <w:r>
-              <w:drawing>
-                <wp:inline distT="0" distB="0" distL="0" distR="0">
-                  <wp:extent cx="1809750" cy="1104900"/>
-                  <wp:effectExtent t="0" r="0" b="0" l="0"/>
-                  <wp:docPr id="1" name="" descr="" title=""/>
-                  <wp:cNvGraphicFramePr>
-                    <a:graphicFrameLocks xmlns:a="http://schemas.openxmlformats.org/drawingml/2006/main" noChangeAspect="1"/>
-                  </wp:cNvGraphicFramePr>
-                  <a:graphic xmlns:a="http://schemas.openxmlformats.org/drawingml/2006/main">
-                    <a:graphicData uri="http://schemas.openxmlformats.org/drawingml/2006/picture">
-                      <pic:pic xmlns:pic="http://schemas.openxmlformats.org/drawingml/2006/picture">
-                        <pic:nvPicPr>
-                          <pic:cNvPr id="0" name="" descr=""/>
-                          <pic:cNvPicPr>
-                            <a:picLocks noChangeAspect="1" noChangeArrowheads="1"/>
-                          </pic:cNvPicPr>
-                        </pic:nvPicPr>
-                        <pic:blipFill>
-                          <a:blip r:embed="rId9" cstate="none"/>
-                          <a:srcRect/>
-                          <a:stretch>
-                            <a:fillRect/>
-                          </a:stretch>
-                        </pic:blipFill>
-                        <pic:spPr bwMode="auto">
-                          <a:xfrm>
-                            <a:off x="0" y="0"/>
-                            <a:ext cx="1809750" cy="1104900"/>
-                          </a:xfrm>
-                          <a:prstGeom prst="rect">
-                            <a:avLst/>
-                          </a:prstGeom>
-                        </pic:spPr>
-                      </pic:pic>
-                    </a:graphicData>
-                  </a:graphic>
-                </wp:inline>
-              </w:drawing>
-            </w:r>
-          </w:p>
-          <w:p>
-            <w:pPr>
-              <w:spacing w:after="0" w:before="0" w:line="2600" w:lineRule="exact"/>
-            </w:pPr>
-          </w:p>
-          <w:p>
-            <w:pPr>
-              <w:keepLines/>
-              <w:spacing w:after="160" w:before="0" w:line="276" w:lineRule="auto"/>
+            <w:tcW w:type="dxa" w:w="1700"/>
+            <w:tcBorders>
+              <w:top w:val="none" w:color="FFFFFF" w:sz="0"/>
+              <w:left w:val="none" w:color="FFFFFF" w:sz="0"/>
+              <w:bottom w:val="single" w:color="2A3A8F" w:sz="4"/>
+              <w:right w:val="none" w:color="FFFFFF" w:sz="0"/>
+            </w:tcBorders>
+            <w:tcMar>
+              <w:top w:type="dxa" w:w="100"/>
+              <w:left w:type="dxa" w:w="0"/>
+              <w:bottom w:type="dxa" w:w="100"/>
+              <w:right w:type="dxa" w:w="100"/>
+            </w:tcMar>
+            <w:vAlign w:val="top"/>
+          </w:tcPr>
+          <w:p>
+            <w:pPr>
+              <w:keepLines/>
+              <w:spacing w:after="0" w:before="0" w:line="276" w:lineRule="auto"/>
             </w:pPr>
             <w:r>
               <w:rPr>
@@ -108,439 +219,269 @@
                 <w:bCs/>
                 <w:caps/>
                 <w:color w:val="9DB2FF"/>
-                <w:spacing w:val="40"/>
+                <w:spacing w:val="30"/>
+                <w:sz w:val="16"/>
+                <w:szCs w:val="16"/>
+              </w:rPr>
+              <w:t xml:space="preserve">Cliente</w:t>
+            </w:r>
+          </w:p>
+        </w:tc>
+        <w:tc>
+          <w:tcPr>
+            <w:tcW w:type="dxa" w:w="7606"/>
+            <w:tcBorders>
+              <w:top w:val="none" w:color="FFFFFF" w:sz="0"/>
+              <w:left w:val="none" w:color="FFFFFF" w:sz="0"/>
+              <w:bottom w:val="single" w:color="2A3A8F" w:sz="4"/>
+              <w:right w:val="none" w:color="FFFFFF" w:sz="0"/>
+            </w:tcBorders>
+            <w:tcMar>
+              <w:top w:type="dxa" w:w="100"/>
+              <w:left w:type="dxa" w:w="100"/>
+              <w:bottom w:type="dxa" w:w="100"/>
+              <w:right w:type="dxa" w:w="0"/>
+            </w:tcMar>
+            <w:vAlign w:val="top"/>
+          </w:tcPr>
+          <w:p>
+            <w:pPr>
+              <w:keepLines/>
+              <w:spacing w:after="0" w:before="0" w:line="276" w:lineRule="auto"/>
+            </w:pPr>
+            <w:r>
+              <w:rPr>
+                <w:rFonts w:ascii="Google Sans" w:cs="Google Sans" w:eastAsia="Google Sans" w:hAnsi="Google Sans"/>
+                <w:color w:val="FFFFFF"/>
                 <w:sz w:val="20"/>
                 <w:szCs w:val="20"/>
               </w:rPr>
-              <w:t xml:space="preserve">Briefing Estratégico &amp; Diagnóstico de Liderança</w:t>
-            </w:r>
-          </w:p>
-          <w:p>
-            <w:pPr>
-              <w:keepLines/>
-              <w:spacing w:after="0" w:before="0" w:line="240" w:lineRule="auto"/>
+              <w:t xml:space="preserve">Home Center</w:t>
+            </w:r>
+          </w:p>
+        </w:tc>
+      </w:tr>
+      <w:tr>
+        <w:trPr>
+          <w:cantSplit/>
+        </w:trPr>
+        <w:tc>
+          <w:tcPr>
+            <w:tcW w:type="dxa" w:w="1700"/>
+            <w:tcBorders>
+              <w:top w:val="none" w:color="FFFFFF" w:sz="0"/>
+              <w:left w:val="none" w:color="FFFFFF" w:sz="0"/>
+              <w:bottom w:val="single" w:color="2A3A8F" w:sz="4"/>
+              <w:right w:val="none" w:color="FFFFFF" w:sz="0"/>
+            </w:tcBorders>
+            <w:tcMar>
+              <w:top w:type="dxa" w:w="100"/>
+              <w:left w:type="dxa" w:w="0"/>
+              <w:bottom w:type="dxa" w:w="100"/>
+              <w:right w:type="dxa" w:w="100"/>
+            </w:tcMar>
+            <w:vAlign w:val="top"/>
+          </w:tcPr>
+          <w:p>
+            <w:pPr>
+              <w:keepLines/>
+              <w:spacing w:after="0" w:before="0" w:line="276" w:lineRule="auto"/>
             </w:pPr>
             <w:r>
               <w:rPr>
                 <w:rFonts w:ascii="Google Sans" w:cs="Google Sans" w:eastAsia="Google Sans" w:hAnsi="Google Sans"/>
                 <w:b/>
                 <w:bCs/>
+                <w:caps/>
+                <w:color w:val="9DB2FF"/>
+                <w:spacing w:val="30"/>
+                <w:sz w:val="16"/>
+                <w:szCs w:val="16"/>
+              </w:rPr>
+              <w:t xml:space="preserve">Áreas</w:t>
+            </w:r>
+          </w:p>
+        </w:tc>
+        <w:tc>
+          <w:tcPr>
+            <w:tcW w:type="dxa" w:w="7606"/>
+            <w:tcBorders>
+              <w:top w:val="none" w:color="FFFFFF" w:sz="0"/>
+              <w:left w:val="none" w:color="FFFFFF" w:sz="0"/>
+              <w:bottom w:val="single" w:color="2A3A8F" w:sz="4"/>
+              <w:right w:val="none" w:color="FFFFFF" w:sz="0"/>
+            </w:tcBorders>
+            <w:tcMar>
+              <w:top w:type="dxa" w:w="100"/>
+              <w:left w:type="dxa" w:w="100"/>
+              <w:bottom w:type="dxa" w:w="100"/>
+              <w:right w:type="dxa" w:w="0"/>
+            </w:tcMar>
+            <w:vAlign w:val="top"/>
+          </w:tcPr>
+          <w:p>
+            <w:pPr>
+              <w:keepLines/>
+              <w:spacing w:after="0" w:before="0" w:line="276" w:lineRule="auto"/>
+            </w:pPr>
+            <w:r>
+              <w:rPr>
+                <w:rFonts w:ascii="Google Sans" w:cs="Google Sans" w:eastAsia="Google Sans" w:hAnsi="Google Sans"/>
                 <w:color w:val="FFFFFF"/>
-                <w:sz w:val="84"/>
-                <w:szCs w:val="84"/>
-              </w:rPr>
-              <w:t xml:space="preserve">Diagnóstico</w:t>
-            </w:r>
-          </w:p>
-          <w:p>
-            <w:pPr>
-              <w:keepLines/>
-              <w:spacing w:after="240" w:before="0" w:line="240" w:lineRule="auto"/>
+                <w:sz w:val="20"/>
+                <w:szCs w:val="20"/>
+              </w:rPr>
+              <w:t xml:space="preserve">Direcção-Geral · Marketing · Comercial · Lojas · Tecnologia · RH &amp; Liderança</w:t>
+            </w:r>
+          </w:p>
+        </w:tc>
+      </w:tr>
+      <w:tr>
+        <w:trPr>
+          <w:cantSplit/>
+        </w:trPr>
+        <w:tc>
+          <w:tcPr>
+            <w:tcW w:type="dxa" w:w="1700"/>
+            <w:tcBorders>
+              <w:top w:val="none" w:color="FFFFFF" w:sz="0"/>
+              <w:left w:val="none" w:color="FFFFFF" w:sz="0"/>
+              <w:bottom w:val="single" w:color="2A3A8F" w:sz="4"/>
+              <w:right w:val="none" w:color="FFFFFF" w:sz="0"/>
+            </w:tcBorders>
+            <w:tcMar>
+              <w:top w:type="dxa" w:w="100"/>
+              <w:left w:type="dxa" w:w="0"/>
+              <w:bottom w:type="dxa" w:w="100"/>
+              <w:right w:type="dxa" w:w="100"/>
+            </w:tcMar>
+            <w:vAlign w:val="top"/>
+          </w:tcPr>
+          <w:p>
+            <w:pPr>
+              <w:keepLines/>
+              <w:spacing w:after="0" w:before="0" w:line="276" w:lineRule="auto"/>
             </w:pPr>
             <w:r>
               <w:rPr>
                 <w:rFonts w:ascii="Google Sans" w:cs="Google Sans" w:eastAsia="Google Sans" w:hAnsi="Google Sans"/>
                 <w:b/>
                 <w:bCs/>
+                <w:caps/>
+                <w:color w:val="9DB2FF"/>
+                <w:spacing w:val="30"/>
+                <w:sz w:val="16"/>
+                <w:szCs w:val="16"/>
+              </w:rPr>
+              <w:t xml:space="preserve">Data</w:t>
+            </w:r>
+          </w:p>
+        </w:tc>
+        <w:tc>
+          <w:tcPr>
+            <w:tcW w:type="dxa" w:w="7606"/>
+            <w:tcBorders>
+              <w:top w:val="none" w:color="FFFFFF" w:sz="0"/>
+              <w:left w:val="none" w:color="FFFFFF" w:sz="0"/>
+              <w:bottom w:val="single" w:color="2A3A8F" w:sz="4"/>
+              <w:right w:val="none" w:color="FFFFFF" w:sz="0"/>
+            </w:tcBorders>
+            <w:tcMar>
+              <w:top w:type="dxa" w:w="100"/>
+              <w:left w:type="dxa" w:w="100"/>
+              <w:bottom w:type="dxa" w:w="100"/>
+              <w:right w:type="dxa" w:w="0"/>
+            </w:tcMar>
+            <w:vAlign w:val="top"/>
+          </w:tcPr>
+          <w:p>
+            <w:pPr>
+              <w:keepLines/>
+              <w:spacing w:after="0" w:before="0" w:line="276" w:lineRule="auto"/>
+            </w:pPr>
+            <w:r>
+              <w:rPr>
+                <w:rFonts w:ascii="Google Sans" w:cs="Google Sans" w:eastAsia="Google Sans" w:hAnsi="Google Sans"/>
                 <w:color w:val="FFFFFF"/>
-                <w:sz w:val="84"/>
-                <w:szCs w:val="84"/>
-              </w:rPr>
-              <w:t xml:space="preserve">360° Pro</w:t>
-            </w:r>
-          </w:p>
-          <w:p>
-            <w:pPr>
-              <w:keepLines/>
-              <w:spacing w:after="480" w:before="0" w:line="320" w:lineRule="auto"/>
-            </w:pPr>
-            <w:r>
-              <w:rPr>
-                <w:rFonts w:ascii="Google Sans" w:cs="Google Sans" w:eastAsia="Google Sans" w:hAnsi="Google Sans"/>
-                <w:color w:val="D7DEFF"/>
-                <w:sz w:val="24"/>
-                <w:szCs w:val="24"/>
-              </w:rPr>
-              <w:t xml:space="preserve">Guia e formulário de recolha da informação fundamental para a construção da estratégia completa da empresa cliente.</w:t>
-            </w:r>
-          </w:p>
-          <w:tbl>
-            <w:tblPr>
-              <w:tblW w:type="dxa" w:w="7500"/>
-              <w:tblBorders>
-                <w:top w:val="none" w:color="FFFFFF" w:sz="0"/>
-                <w:left w:val="none" w:color="FFFFFF" w:sz="0"/>
-                <w:bottom w:val="none" w:color="FFFFFF" w:sz="0"/>
-                <w:right w:val="none" w:color="FFFFFF" w:sz="0"/>
-                <w:insideH w:val="none" w:color="FFFFFF" w:sz="0"/>
-                <w:insideV w:val="none" w:color="FFFFFF" w:sz="0"/>
-              </w:tblBorders>
-              <w:tblLayout w:type="fixed"/>
-            </w:tblPr>
-            <w:tblGrid>
-              <w:gridCol w:w="1500"/>
-              <w:gridCol w:w="6000"/>
-            </w:tblGrid>
-            <w:tr>
-              <w:trPr>
-                <w:cantSplit/>
-              </w:trPr>
-              <w:tc>
-                <w:tcPr>
-                  <w:tcW w:type="dxa" w:w="1500"/>
-                  <w:tcBorders>
-                    <w:top w:val="none" w:color="FFFFFF" w:sz="0"/>
-                    <w:left w:val="none" w:color="FFFFFF" w:sz="0"/>
-                    <w:bottom w:val="single" w:color="2A3A8F" w:sz="4"/>
-                    <w:right w:val="none" w:color="FFFFFF" w:sz="0"/>
-                  </w:tcBorders>
-                  <w:tcMar>
-                    <w:top w:type="dxa" w:w="100"/>
-                    <w:left w:type="dxa" w:w="0"/>
-                    <w:bottom w:type="dxa" w:w="100"/>
-                    <w:right w:type="dxa" w:w="100"/>
-                  </w:tcMar>
-                  <w:vAlign w:val="top"/>
-                </w:tcPr>
-                <w:p>
-                  <w:pPr>
-                    <w:keepLines/>
-                    <w:spacing w:after="0" w:before="0" w:line="276" w:lineRule="auto"/>
-                  </w:pPr>
-                  <w:r>
-                    <w:rPr>
-                      <w:rFonts w:ascii="Google Sans" w:cs="Google Sans" w:eastAsia="Google Sans" w:hAnsi="Google Sans"/>
-                      <w:b/>
-                      <w:bCs/>
-                      <w:caps/>
-                      <w:color w:val="9DB2FF"/>
-                      <w:spacing w:val="30"/>
-                      <w:sz w:val="16"/>
-                      <w:szCs w:val="16"/>
-                    </w:rPr>
-                    <w:t xml:space="preserve">Cliente</w:t>
-                  </w:r>
-                </w:p>
-              </w:tc>
-              <w:tc>
-                <w:tcPr>
-                  <w:tcW w:type="dxa" w:w="6000"/>
-                  <w:tcBorders>
-                    <w:top w:val="none" w:color="FFFFFF" w:sz="0"/>
-                    <w:left w:val="none" w:color="FFFFFF" w:sz="0"/>
-                    <w:bottom w:val="single" w:color="2A3A8F" w:sz="4"/>
-                    <w:right w:val="none" w:color="FFFFFF" w:sz="0"/>
-                  </w:tcBorders>
-                  <w:tcMar>
-                    <w:top w:type="dxa" w:w="100"/>
-                    <w:left w:type="dxa" w:w="100"/>
-                    <w:bottom w:type="dxa" w:w="100"/>
-                    <w:right w:type="dxa" w:w="0"/>
-                  </w:tcMar>
-                  <w:vAlign w:val="top"/>
-                </w:tcPr>
-                <w:p>
-                  <w:pPr>
-                    <w:keepLines/>
-                    <w:spacing w:after="0" w:before="0" w:line="276" w:lineRule="auto"/>
-                  </w:pPr>
-                  <w:r>
-                    <w:rPr>
-                      <w:rFonts w:ascii="Google Sans" w:cs="Google Sans" w:eastAsia="Google Sans" w:hAnsi="Google Sans"/>
-                      <w:color w:val="FFFFFF"/>
-                      <w:sz w:val="20"/>
-                      <w:szCs w:val="20"/>
-                    </w:rPr>
-                    <w:t xml:space="preserve">Home Center</w:t>
-                  </w:r>
-                </w:p>
-              </w:tc>
-            </w:tr>
-            <w:tr>
-              <w:trPr>
-                <w:cantSplit/>
-              </w:trPr>
-              <w:tc>
-                <w:tcPr>
-                  <w:tcW w:type="dxa" w:w="1500"/>
-                  <w:tcBorders>
-                    <w:top w:val="none" w:color="FFFFFF" w:sz="0"/>
-                    <w:left w:val="none" w:color="FFFFFF" w:sz="0"/>
-                    <w:bottom w:val="single" w:color="2A3A8F" w:sz="4"/>
-                    <w:right w:val="none" w:color="FFFFFF" w:sz="0"/>
-                  </w:tcBorders>
-                  <w:tcMar>
-                    <w:top w:type="dxa" w:w="100"/>
-                    <w:left w:type="dxa" w:w="0"/>
-                    <w:bottom w:type="dxa" w:w="100"/>
-                    <w:right w:type="dxa" w:w="100"/>
-                  </w:tcMar>
-                  <w:vAlign w:val="top"/>
-                </w:tcPr>
-                <w:p>
-                  <w:pPr>
-                    <w:keepLines/>
-                    <w:spacing w:after="0" w:before="0" w:line="276" w:lineRule="auto"/>
-                  </w:pPr>
-                  <w:r>
-                    <w:rPr>
-                      <w:rFonts w:ascii="Google Sans" w:cs="Google Sans" w:eastAsia="Google Sans" w:hAnsi="Google Sans"/>
-                      <w:b/>
-                      <w:bCs/>
-                      <w:caps/>
-                      <w:color w:val="9DB2FF"/>
-                      <w:spacing w:val="30"/>
-                      <w:sz w:val="16"/>
-                      <w:szCs w:val="16"/>
-                    </w:rPr>
-                    <w:t xml:space="preserve">Áreas</w:t>
-                  </w:r>
-                </w:p>
-              </w:tc>
-              <w:tc>
-                <w:tcPr>
-                  <w:tcW w:type="dxa" w:w="6000"/>
-                  <w:tcBorders>
-                    <w:top w:val="none" w:color="FFFFFF" w:sz="0"/>
-                    <w:left w:val="none" w:color="FFFFFF" w:sz="0"/>
-                    <w:bottom w:val="single" w:color="2A3A8F" w:sz="4"/>
-                    <w:right w:val="none" w:color="FFFFFF" w:sz="0"/>
-                  </w:tcBorders>
-                  <w:tcMar>
-                    <w:top w:type="dxa" w:w="100"/>
-                    <w:left w:type="dxa" w:w="100"/>
-                    <w:bottom w:type="dxa" w:w="100"/>
-                    <w:right w:type="dxa" w:w="0"/>
-                  </w:tcMar>
-                  <w:vAlign w:val="top"/>
-                </w:tcPr>
-                <w:p>
-                  <w:pPr>
-                    <w:keepLines/>
-                    <w:spacing w:after="0" w:before="0" w:line="276" w:lineRule="auto"/>
-                  </w:pPr>
-                  <w:r>
-                    <w:rPr>
-                      <w:rFonts w:ascii="Google Sans" w:cs="Google Sans" w:eastAsia="Google Sans" w:hAnsi="Google Sans"/>
-                      <w:color w:val="FFFFFF"/>
-                      <w:sz w:val="20"/>
-                      <w:szCs w:val="20"/>
-                    </w:rPr>
-                    <w:t xml:space="preserve">Direcção-Geral · Marketing · Comercial · Lojas · Tecnologia · RH &amp; Liderança</w:t>
-                  </w:r>
-                </w:p>
-              </w:tc>
-            </w:tr>
-            <w:tr>
-              <w:trPr>
-                <w:cantSplit/>
-              </w:trPr>
-              <w:tc>
-                <w:tcPr>
-                  <w:tcW w:type="dxa" w:w="1500"/>
-                  <w:tcBorders>
-                    <w:top w:val="none" w:color="FFFFFF" w:sz="0"/>
-                    <w:left w:val="none" w:color="FFFFFF" w:sz="0"/>
-                    <w:bottom w:val="single" w:color="2A3A8F" w:sz="4"/>
-                    <w:right w:val="none" w:color="FFFFFF" w:sz="0"/>
-                  </w:tcBorders>
-                  <w:tcMar>
-                    <w:top w:type="dxa" w:w="100"/>
-                    <w:left w:type="dxa" w:w="0"/>
-                    <w:bottom w:type="dxa" w:w="100"/>
-                    <w:right w:type="dxa" w:w="100"/>
-                  </w:tcMar>
-                  <w:vAlign w:val="top"/>
-                </w:tcPr>
-                <w:p>
-                  <w:pPr>
-                    <w:keepLines/>
-                    <w:spacing w:after="0" w:before="0" w:line="276" w:lineRule="auto"/>
-                  </w:pPr>
-                  <w:r>
-                    <w:rPr>
-                      <w:rFonts w:ascii="Google Sans" w:cs="Google Sans" w:eastAsia="Google Sans" w:hAnsi="Google Sans"/>
-                      <w:b/>
-                      <w:bCs/>
-                      <w:caps/>
-                      <w:color w:val="9DB2FF"/>
-                      <w:spacing w:val="30"/>
-                      <w:sz w:val="16"/>
-                      <w:szCs w:val="16"/>
-                    </w:rPr>
-                    <w:t xml:space="preserve">Data</w:t>
-                  </w:r>
-                </w:p>
-              </w:tc>
-              <w:tc>
-                <w:tcPr>
-                  <w:tcW w:type="dxa" w:w="6000"/>
-                  <w:tcBorders>
-                    <w:top w:val="none" w:color="FFFFFF" w:sz="0"/>
-                    <w:left w:val="none" w:color="FFFFFF" w:sz="0"/>
-                    <w:bottom w:val="single" w:color="2A3A8F" w:sz="4"/>
-                    <w:right w:val="none" w:color="FFFFFF" w:sz="0"/>
-                  </w:tcBorders>
-                  <w:tcMar>
-                    <w:top w:type="dxa" w:w="100"/>
-                    <w:left w:type="dxa" w:w="100"/>
-                    <w:bottom w:type="dxa" w:w="100"/>
-                    <w:right w:type="dxa" w:w="0"/>
-                  </w:tcMar>
-                  <w:vAlign w:val="top"/>
-                </w:tcPr>
-                <w:p>
-                  <w:pPr>
-                    <w:keepLines/>
-                    <w:spacing w:after="0" w:before="0" w:line="276" w:lineRule="auto"/>
-                  </w:pPr>
-                  <w:r>
-                    <w:rPr>
-                      <w:rFonts w:ascii="Google Sans" w:cs="Google Sans" w:eastAsia="Google Sans" w:hAnsi="Google Sans"/>
-                      <w:color w:val="FFFFFF"/>
-                      <w:sz w:val="20"/>
-                      <w:szCs w:val="20"/>
-                    </w:rPr>
-                    <w:t xml:space="preserve">Outubro de 2026</w:t>
-                  </w:r>
-                </w:p>
-              </w:tc>
-            </w:tr>
-            <w:tr>
-              <w:trPr>
-                <w:cantSplit/>
-              </w:trPr>
-              <w:tc>
-                <w:tcPr>
-                  <w:tcW w:type="dxa" w:w="1500"/>
-                  <w:tcBorders>
-                    <w:top w:val="none" w:color="FFFFFF" w:sz="0"/>
-                    <w:left w:val="none" w:color="FFFFFF" w:sz="0"/>
-                    <w:bottom w:val="single" w:color="2A3A8F" w:sz="4"/>
-                    <w:right w:val="none" w:color="FFFFFF" w:sz="0"/>
-                  </w:tcBorders>
-                  <w:tcMar>
-                    <w:top w:type="dxa" w:w="100"/>
-                    <w:left w:type="dxa" w:w="0"/>
-                    <w:bottom w:type="dxa" w:w="100"/>
-                    <w:right w:type="dxa" w:w="100"/>
-                  </w:tcMar>
-                  <w:vAlign w:val="top"/>
-                </w:tcPr>
-                <w:p>
-                  <w:pPr>
-                    <w:keepLines/>
-                    <w:spacing w:after="0" w:before="0" w:line="276" w:lineRule="auto"/>
-                  </w:pPr>
-                  <w:r>
-                    <w:rPr>
-                      <w:rFonts w:ascii="Google Sans" w:cs="Google Sans" w:eastAsia="Google Sans" w:hAnsi="Google Sans"/>
-                      <w:b/>
-                      <w:bCs/>
-                      <w:caps/>
-                      <w:color w:val="9DB2FF"/>
-                      <w:spacing w:val="30"/>
-                      <w:sz w:val="16"/>
-                      <w:szCs w:val="16"/>
-                    </w:rPr>
-                    <w:t xml:space="preserve">Versão</w:t>
-                  </w:r>
-                </w:p>
-              </w:tc>
-              <w:tc>
-                <w:tcPr>
-                  <w:tcW w:type="dxa" w:w="6000"/>
-                  <w:tcBorders>
-                    <w:top w:val="none" w:color="FFFFFF" w:sz="0"/>
-                    <w:left w:val="none" w:color="FFFFFF" w:sz="0"/>
-                    <w:bottom w:val="single" w:color="2A3A8F" w:sz="4"/>
-                    <w:right w:val="none" w:color="FFFFFF" w:sz="0"/>
-                  </w:tcBorders>
-                  <w:tcMar>
-                    <w:top w:type="dxa" w:w="100"/>
-                    <w:left w:type="dxa" w:w="100"/>
-                    <w:bottom w:type="dxa" w:w="100"/>
-                    <w:right w:type="dxa" w:w="0"/>
-                  </w:tcMar>
-                  <w:vAlign w:val="top"/>
-                </w:tcPr>
-                <w:p>
-                  <w:pPr>
-                    <w:keepLines/>
-                    <w:spacing w:after="0" w:before="0" w:line="276" w:lineRule="auto"/>
-                  </w:pPr>
-                  <w:r>
-                    <w:rPr>
-                      <w:rFonts w:ascii="Google Sans" w:cs="Google Sans" w:eastAsia="Google Sans" w:hAnsi="Google Sans"/>
-                      <w:color w:val="FFFFFF"/>
-                      <w:sz w:val="20"/>
-                      <w:szCs w:val="20"/>
-                    </w:rPr>
-                    <w:t xml:space="preserve">1.0 · Confidencial</w:t>
-                  </w:r>
-                </w:p>
-              </w:tc>
-            </w:tr>
-          </w:tbl>
-          <w:p>
-            <w:pPr>
-              <w:spacing w:after="0" w:before="0" w:line="3000" w:lineRule="exact"/>
-            </w:pPr>
-          </w:p>
-          <w:p>
-            <w:pPr>
-              <w:keepLines/>
-              <w:spacing w:after="60" w:before="0" w:line="276" w:lineRule="auto"/>
-            </w:pPr>
-            <w:r>
-              <w:rPr>
-                <w:rFonts w:ascii="Google Sans" w:cs="Google Sans" w:eastAsia="Google Sans" w:hAnsi="Google Sans"/>
-                <w:color w:val="FFFFFF"/>
-                <w:sz w:val="18"/>
-                <w:szCs w:val="18"/>
-              </w:rPr>
-              <w:t xml:space="preserve">Produzido por </w:t>
-            </w:r>
+                <w:sz w:val="20"/>
+                <w:szCs w:val="20"/>
+              </w:rPr>
+              <w:t xml:space="preserve">Outubro de 2026</w:t>
+            </w:r>
+          </w:p>
+        </w:tc>
+      </w:tr>
+      <w:tr>
+        <w:trPr>
+          <w:cantSplit/>
+        </w:trPr>
+        <w:tc>
+          <w:tcPr>
+            <w:tcW w:type="dxa" w:w="1700"/>
+            <w:tcBorders>
+              <w:top w:val="none" w:color="FFFFFF" w:sz="0"/>
+              <w:left w:val="none" w:color="FFFFFF" w:sz="0"/>
+              <w:bottom w:val="single" w:color="2A3A8F" w:sz="4"/>
+              <w:right w:val="none" w:color="FFFFFF" w:sz="0"/>
+            </w:tcBorders>
+            <w:tcMar>
+              <w:top w:type="dxa" w:w="100"/>
+              <w:left w:type="dxa" w:w="0"/>
+              <w:bottom w:type="dxa" w:w="100"/>
+              <w:right w:type="dxa" w:w="100"/>
+            </w:tcMar>
+            <w:vAlign w:val="top"/>
+          </w:tcPr>
+          <w:p>
+            <w:pPr>
+              <w:keepLines/>
+              <w:spacing w:after="0" w:before="0" w:line="276" w:lineRule="auto"/>
+            </w:pPr>
             <w:r>
               <w:rPr>
                 <w:rFonts w:ascii="Google Sans" w:cs="Google Sans" w:eastAsia="Google Sans" w:hAnsi="Google Sans"/>
                 <w:b/>
                 <w:bCs/>
+                <w:caps/>
+                <w:color w:val="9DB2FF"/>
+                <w:spacing w:val="30"/>
+                <w:sz w:val="16"/>
+                <w:szCs w:val="16"/>
+              </w:rPr>
+              <w:t xml:space="preserve">Versão</w:t>
+            </w:r>
+          </w:p>
+        </w:tc>
+        <w:tc>
+          <w:tcPr>
+            <w:tcW w:type="dxa" w:w="7606"/>
+            <w:tcBorders>
+              <w:top w:val="none" w:color="FFFFFF" w:sz="0"/>
+              <w:left w:val="none" w:color="FFFFFF" w:sz="0"/>
+              <w:bottom w:val="single" w:color="2A3A8F" w:sz="4"/>
+              <w:right w:val="none" w:color="FFFFFF" w:sz="0"/>
+            </w:tcBorders>
+            <w:tcMar>
+              <w:top w:type="dxa" w:w="100"/>
+              <w:left w:type="dxa" w:w="100"/>
+              <w:bottom w:type="dxa" w:w="100"/>
+              <w:right w:type="dxa" w:w="0"/>
+            </w:tcMar>
+            <w:vAlign w:val="top"/>
+          </w:tcPr>
+          <w:p>
+            <w:pPr>
+              <w:keepLines/>
+              <w:spacing w:after="0" w:before="0" w:line="276" w:lineRule="auto"/>
+            </w:pPr>
+            <w:r>
+              <w:rPr>
+                <w:rFonts w:ascii="Google Sans" w:cs="Google Sans" w:eastAsia="Google Sans" w:hAnsi="Google Sans"/>
                 <w:color w:val="FFFFFF"/>
-                <w:sz w:val="18"/>
-                <w:szCs w:val="18"/>
-              </w:rPr>
-              <w:t xml:space="preserve">Midia Pro · Comunicação e Imagem</w:t>
-            </w:r>
-          </w:p>
-          <w:p>
-            <w:pPr>
-              <w:keepLines/>
-              <w:spacing w:after="30" w:before="0" w:line="276" w:lineRule="auto"/>
-            </w:pPr>
-            <w:r>
-              <w:rPr>
-                <w:rFonts w:ascii="Google Sans" w:cs="Google Sans" w:eastAsia="Google Sans" w:hAnsi="Google Sans"/>
-                <w:color w:val="B9C4F5"/>
-                <w:sz w:val="17"/>
-                <w:szCs w:val="17"/>
-              </w:rPr>
-              <w:t xml:space="preserve">Av. Vladimir Lenine nº 1895, R/C · Maputo, Moçambique</w:t>
-            </w:r>
-          </w:p>
-          <w:p>
-            <w:pPr>
-              <w:keepLines/>
-              <w:spacing w:after="0" w:before="0" w:line="276" w:lineRule="auto"/>
-            </w:pPr>
-            <w:r>
-              <w:rPr>
-                <w:rFonts w:ascii="Google Sans" w:cs="Google Sans" w:eastAsia="Google Sans" w:hAnsi="Google Sans"/>
-                <w:color w:val="B9C4F5"/>
-                <w:sz w:val="17"/>
-                <w:szCs w:val="17"/>
-              </w:rPr>
-              <w:t xml:space="preserve">+258 85 589 0000 · info@midiapro.co.mz</w:t>
+                <w:sz w:val="20"/>
+                <w:szCs w:val="20"/>
+              </w:rPr>
+              <w:t xml:space="preserve">1.0 · Confidencial</w:t>
             </w:r>
           </w:p>
         </w:tc>
@@ -548,14 +489,70 @@
     </w:tbl>
     <w:p>
       <w:pPr>
-        <w:spacing w:after="0" w:before="0" w:line="20" w:lineRule="exact"/>
+        <w:spacing w:after="0" w:before="0" w:line="2600" w:lineRule="exact"/>
       </w:pPr>
+    </w:p>
+    <w:p>
+      <w:pPr>
+        <w:keepLines/>
+        <w:spacing w:after="60" w:before="0" w:line="276" w:lineRule="auto"/>
+      </w:pPr>
+      <w:r>
+        <w:rPr>
+          <w:rFonts w:ascii="Google Sans" w:cs="Google Sans" w:eastAsia="Google Sans" w:hAnsi="Google Sans"/>
+          <w:color w:val="FFFFFF"/>
+          <w:sz w:val="18"/>
+          <w:szCs w:val="18"/>
+        </w:rPr>
+        <w:t xml:space="preserve">Produzido por </w:t>
+      </w:r>
+      <w:r>
+        <w:rPr>
+          <w:rFonts w:ascii="Google Sans" w:cs="Google Sans" w:eastAsia="Google Sans" w:hAnsi="Google Sans"/>
+          <w:b/>
+          <w:bCs/>
+          <w:color w:val="FFFFFF"/>
+          <w:sz w:val="18"/>
+          <w:szCs w:val="18"/>
+        </w:rPr>
+        <w:t xml:space="preserve">Midia Pro · Comunicação e Imagem</w:t>
+      </w:r>
+    </w:p>
+    <w:p>
+      <w:pPr>
+        <w:keepLines/>
+        <w:spacing w:after="30" w:before="0" w:line="276" w:lineRule="auto"/>
+      </w:pPr>
+      <w:r>
+        <w:rPr>
+          <w:rFonts w:ascii="Google Sans" w:cs="Google Sans" w:eastAsia="Google Sans" w:hAnsi="Google Sans"/>
+          <w:color w:val="B9C4F5"/>
+          <w:sz w:val="17"/>
+          <w:szCs w:val="17"/>
+        </w:rPr>
+        <w:t xml:space="preserve">Av. Vladimir Lenine nº 1895, R/C · Maputo, Moçambique</w:t>
+      </w:r>
+    </w:p>
+    <w:p>
+      <w:pPr>
+        <w:keepLines/>
+        <w:spacing w:after="0" w:before="0" w:line="276" w:lineRule="auto"/>
+      </w:pPr>
+      <w:r>
+        <w:rPr>
+          <w:rFonts w:ascii="Google Sans" w:cs="Google Sans" w:eastAsia="Google Sans" w:hAnsi="Google Sans"/>
+          <w:color w:val="B9C4F5"/>
+          <w:sz w:val="17"/>
+          <w:szCs w:val="17"/>
+        </w:rPr>
+        <w:t xml:space="preserve">+258 85 589 0000 · info@midiapro.co.mz</w:t>
+      </w:r>
     </w:p>
     <w:p>
       <w:pPr>
         <w:sectPr>
           <w:pgSz w:w="11906" w:h="16838" w:orient="portrait"/>
-          <w:pgMar w:top="0" w:right="0" w:bottom="0" w:left="0" w:header="0" w:footer="0" w:gutter="0"/>
+          <w:pgMar w:top="1300" w:right="1300" w:bottom="900" w:left="1300" w:header="0" w:footer="0" w:gutter="0"/>
           <w:pgNumType/>
           <w:docGrid w:linePitch="360"/>
         </w:sectPr>

</xml_diff>

<commit_message>
Diagnóstico 360° Pro: PDF interactivo
Acrescenta o PDF preenchível (375 campos: texto, caixas de selecção,
botões de opção agrupados por pergunta, lista de classificação), com
links do mapa para cada etapa, marcadores, email no rodapé e botões
Enviar/Imprimir. É gerado do mesmo conteúdo do DOCX: build.js em modo
FORM=1 deixa marcadores invisíveis que make_pdf_form.py converte em
campos depois da conversão pelo LibreOffice.

Co-Authored-By: Claude Opus 5.5 <noreply@anthropic.com>
Claude-Session: https://claude.ai/code/session_01NnbiwV4Fqx4dXT646nXdSp
</commit_message>
<xml_diff>
--- a/midiapro/diagnostico-360/Diagnostico_360_Pro_Briefing_Home_Center.docx
+++ b/midiapro/diagnostico-360/Diagnostico_360_Pro_Briefing_Home_Center.docx
@@ -7026,8 +7026,7 @@
           </w:tcPr>
           <w:p>
             <w:pPr>
-              <w:keepLines/>
-              <w:spacing w:after="0" w:before="0" w:line="276" w:lineRule="auto"/>
+              <w:spacing w:after="0"/>
             </w:pPr>
           </w:p>
         </w:tc>
@@ -7177,8 +7176,7 @@
           </w:tcPr>
           <w:p>
             <w:pPr>
-              <w:keepLines/>
-              <w:spacing w:after="0" w:before="0" w:line="276" w:lineRule="auto"/>
+              <w:spacing w:after="0"/>
             </w:pPr>
           </w:p>
         </w:tc>
@@ -7403,8 +7401,7 @@
           </w:tcPr>
           <w:p>
             <w:pPr>
-              <w:keepLines/>
-              <w:spacing w:after="0" w:before="0" w:line="276" w:lineRule="auto"/>
+              <w:spacing w:after="0"/>
             </w:pPr>
           </w:p>
         </w:tc>
@@ -7452,8 +7449,7 @@
           </w:tcPr>
           <w:p>
             <w:pPr>
-              <w:keepLines/>
-              <w:spacing w:after="0" w:before="0" w:line="276" w:lineRule="auto"/>
+              <w:spacing w:after="0"/>
             </w:pPr>
           </w:p>
         </w:tc>
@@ -7678,8 +7674,7 @@
           </w:tcPr>
           <w:p>
             <w:pPr>
-              <w:keepLines/>
-              <w:spacing w:after="0" w:before="0" w:line="276" w:lineRule="auto"/>
+              <w:spacing w:after="0"/>
             </w:pPr>
           </w:p>
         </w:tc>
@@ -7727,8 +7722,7 @@
           </w:tcPr>
           <w:p>
             <w:pPr>
-              <w:keepLines/>
-              <w:spacing w:after="0" w:before="0" w:line="276" w:lineRule="auto"/>
+              <w:spacing w:after="0"/>
             </w:pPr>
           </w:p>
         </w:tc>
@@ -7867,8 +7861,7 @@
           </w:tcPr>
           <w:p>
             <w:pPr>
-              <w:keepLines/>
-              <w:spacing w:after="0" w:before="0" w:line="276" w:lineRule="auto"/>
+              <w:spacing w:after="0"/>
             </w:pPr>
           </w:p>
         </w:tc>
@@ -8018,8 +8011,7 @@
           </w:tcPr>
           <w:p>
             <w:pPr>
-              <w:keepLines/>
-              <w:spacing w:after="0" w:before="0" w:line="276" w:lineRule="auto"/>
+              <w:spacing w:after="0"/>
             </w:pPr>
           </w:p>
         </w:tc>
@@ -9222,8 +9214,7 @@
           </w:tcPr>
           <w:p>
             <w:pPr>
-              <w:keepLines/>
-              <w:spacing w:after="0" w:before="0" w:line="276" w:lineRule="auto"/>
+              <w:spacing w:after="0"/>
             </w:pPr>
           </w:p>
         </w:tc>
@@ -9714,8 +9705,7 @@
           </w:tcPr>
           <w:p>
             <w:pPr>
-              <w:keepLines/>
-              <w:spacing w:after="0" w:before="0" w:line="276" w:lineRule="auto"/>
+              <w:spacing w:after="0"/>
             </w:pPr>
           </w:p>
         </w:tc>
@@ -10492,8 +10482,7 @@
     </w:tbl>
     <w:p>
       <w:pPr>
-        <w:keepLines/>
-        <w:spacing w:after="0" w:before="60" w:line="276" w:lineRule="auto"/>
+        <w:spacing w:after="0" w:before="60"/>
       </w:pPr>
       <w:r>
         <w:rPr>
@@ -10502,7 +10491,16 @@
           <w:sz w:val="17"/>
           <w:szCs w:val="17"/>
         </w:rPr>
-        <w:t xml:space="preserve">Outro / detalhe: ________________________________________________</w:t>
+        <w:t xml:space="preserve">Outro / detalhe: </w:t>
+      </w:r>
+      <w:r>
+        <w:rPr>
+          <w:rFonts w:ascii="Google Sans" w:cs="Google Sans" w:eastAsia="Google Sans" w:hAnsi="Google Sans"/>
+          <w:color w:val="5B6384"/>
+          <w:sz w:val="17"/>
+          <w:szCs w:val="17"/>
+        </w:rPr>
+        <w:t xml:space="preserve">________________________________________________</w:t>
       </w:r>
     </w:p>
     <w:p>
@@ -11171,8 +11169,7 @@
           </w:tcPr>
           <w:p>
             <w:pPr>
-              <w:keepLines/>
-              <w:spacing w:after="0" w:before="0" w:line="276" w:lineRule="auto"/>
+              <w:spacing w:after="0"/>
             </w:pPr>
           </w:p>
         </w:tc>
@@ -11564,8 +11561,7 @@
           </w:tcPr>
           <w:p>
             <w:pPr>
-              <w:keepLines/>
-              <w:spacing w:after="0" w:before="0" w:line="276" w:lineRule="auto"/>
+              <w:spacing w:after="0"/>
             </w:pPr>
           </w:p>
         </w:tc>
@@ -11715,8 +11711,7 @@
           </w:tcPr>
           <w:p>
             <w:pPr>
-              <w:keepLines/>
-              <w:spacing w:after="0" w:before="0" w:line="276" w:lineRule="auto"/>
+              <w:spacing w:after="0"/>
             </w:pPr>
           </w:p>
         </w:tc>
@@ -11855,8 +11850,7 @@
           </w:tcPr>
           <w:p>
             <w:pPr>
-              <w:keepLines/>
-              <w:spacing w:after="0" w:before="0" w:line="276" w:lineRule="auto"/>
+              <w:spacing w:after="0"/>
             </w:pPr>
           </w:p>
         </w:tc>
@@ -13859,8 +13853,7 @@
           </w:tcPr>
           <w:p>
             <w:pPr>
-              <w:keepLines/>
-              <w:spacing w:after="0" w:before="0" w:line="276" w:lineRule="auto"/>
+              <w:spacing w:after="0"/>
             </w:pPr>
           </w:p>
         </w:tc>
@@ -13999,8 +13992,7 @@
           </w:tcPr>
           <w:p>
             <w:pPr>
-              <w:keepLines/>
-              <w:spacing w:after="0" w:before="0" w:line="276" w:lineRule="auto"/>
+              <w:spacing w:after="0"/>
             </w:pPr>
           </w:p>
         </w:tc>
@@ -14111,8 +14103,7 @@
           </w:tcPr>
           <w:p>
             <w:pPr>
-              <w:keepLines/>
-              <w:spacing w:after="0" w:before="0" w:line="276" w:lineRule="auto"/>
+              <w:spacing w:after="0"/>
             </w:pPr>
           </w:p>
         </w:tc>
@@ -15311,8 +15302,7 @@
           </w:tcPr>
           <w:p>
             <w:pPr>
-              <w:keepLines/>
-              <w:spacing w:after="0" w:before="0" w:line="276" w:lineRule="auto"/>
+              <w:spacing w:after="0"/>
             </w:pPr>
           </w:p>
         </w:tc>
@@ -15451,8 +15441,7 @@
           </w:tcPr>
           <w:p>
             <w:pPr>
-              <w:keepLines/>
-              <w:spacing w:after="0" w:before="0" w:line="276" w:lineRule="auto"/>
+              <w:spacing w:after="0"/>
             </w:pPr>
           </w:p>
         </w:tc>
@@ -15591,8 +15580,7 @@
           </w:tcPr>
           <w:p>
             <w:pPr>
-              <w:keepLines/>
-              <w:spacing w:after="0" w:before="0" w:line="276" w:lineRule="auto"/>
+              <w:spacing w:after="0"/>
             </w:pPr>
           </w:p>
         </w:tc>
@@ -17349,8 +17337,7 @@
           </w:tcPr>
           <w:p>
             <w:pPr>
-              <w:keepLines/>
-              <w:spacing w:after="0" w:before="0" w:line="276" w:lineRule="auto"/>
+              <w:spacing w:after="0"/>
             </w:pPr>
           </w:p>
         </w:tc>
@@ -17461,8 +17448,7 @@
           </w:tcPr>
           <w:p>
             <w:pPr>
-              <w:keepLines/>
-              <w:spacing w:after="0" w:before="0" w:line="276" w:lineRule="auto"/>
+              <w:spacing w:after="0"/>
             </w:pPr>
           </w:p>
         </w:tc>
@@ -17659,8 +17645,7 @@
           </w:tcPr>
           <w:p>
             <w:pPr>
-              <w:keepLines/>
-              <w:spacing w:after="0" w:before="0" w:line="276" w:lineRule="auto"/>
+              <w:spacing w:after="0"/>
             </w:pPr>
           </w:p>
         </w:tc>
@@ -17708,8 +17693,7 @@
           </w:tcPr>
           <w:p>
             <w:pPr>
-              <w:keepLines/>
-              <w:spacing w:after="0" w:before="0" w:line="276" w:lineRule="auto"/>
+              <w:spacing w:after="0"/>
             </w:pPr>
           </w:p>
         </w:tc>
@@ -19448,8 +19432,7 @@
           </w:tcPr>
           <w:p>
             <w:pPr>
-              <w:keepLines/>
-              <w:spacing w:after="0" w:before="0" w:line="276" w:lineRule="auto"/>
+              <w:spacing w:after="0"/>
             </w:pPr>
           </w:p>
         </w:tc>
@@ -19599,8 +19582,7 @@
           </w:tcPr>
           <w:p>
             <w:pPr>
-              <w:keepLines/>
-              <w:spacing w:after="0" w:before="0" w:line="276" w:lineRule="auto"/>
+              <w:spacing w:after="0"/>
             </w:pPr>
           </w:p>
         </w:tc>
@@ -20035,8 +20017,7 @@
     </w:tbl>
     <w:p>
       <w:pPr>
-        <w:keepLines/>
-        <w:spacing w:after="0" w:before="60" w:line="276" w:lineRule="auto"/>
+        <w:spacing w:after="0" w:before="60"/>
       </w:pPr>
       <w:r>
         <w:rPr>
@@ -20045,7 +20026,16 @@
           <w:sz w:val="17"/>
           <w:szCs w:val="17"/>
         </w:rPr>
-        <w:t xml:space="preserve">Outro / detalhe: ________________________________________________</w:t>
+        <w:t xml:space="preserve">Outro / detalhe: </w:t>
+      </w:r>
+      <w:r>
+        <w:rPr>
+          <w:rFonts w:ascii="Google Sans" w:cs="Google Sans" w:eastAsia="Google Sans" w:hAnsi="Google Sans"/>
+          <w:color w:val="5B6384"/>
+          <w:sz w:val="17"/>
+          <w:szCs w:val="17"/>
+        </w:rPr>
+        <w:t xml:space="preserve">________________________________________________</w:t>
       </w:r>
     </w:p>
     <w:p>
@@ -20181,8 +20171,7 @@
           </w:tcPr>
           <w:p>
             <w:pPr>
-              <w:keepLines/>
-              <w:spacing w:after="0" w:before="0" w:line="276" w:lineRule="auto"/>
+              <w:spacing w:after="0"/>
             </w:pPr>
           </w:p>
         </w:tc>
@@ -23120,8 +23109,7 @@
           </w:tcPr>
           <w:p>
             <w:pPr>
-              <w:keepLines/>
-              <w:spacing w:after="0" w:before="0" w:line="276" w:lineRule="auto"/>
+              <w:spacing w:after="0"/>
             </w:pPr>
           </w:p>
         </w:tc>
@@ -23232,8 +23220,7 @@
           </w:tcPr>
           <w:p>
             <w:pPr>
-              <w:keepLines/>
-              <w:spacing w:after="0" w:before="0" w:line="276" w:lineRule="auto"/>
+              <w:spacing w:after="0"/>
             </w:pPr>
           </w:p>
         </w:tc>
@@ -23749,8 +23736,7 @@
           </w:tcPr>
           <w:p>
             <w:pPr>
-              <w:keepLines/>
-              <w:spacing w:after="0" w:before="0" w:line="276" w:lineRule="auto"/>
+              <w:spacing w:after="0"/>
             </w:pPr>
           </w:p>
         </w:tc>
@@ -25068,8 +25054,7 @@
           </w:tcPr>
           <w:p>
             <w:pPr>
-              <w:keepLines/>
-              <w:spacing w:after="0" w:before="0" w:line="276" w:lineRule="auto"/>
+              <w:spacing w:after="0"/>
             </w:pPr>
           </w:p>
         </w:tc>
@@ -25180,8 +25165,7 @@
           </w:tcPr>
           <w:p>
             <w:pPr>
-              <w:keepLines/>
-              <w:spacing w:after="0" w:before="0" w:line="276" w:lineRule="auto"/>
+              <w:spacing w:after="0"/>
             </w:pPr>
           </w:p>
         </w:tc>
@@ -25320,8 +25304,7 @@
           </w:tcPr>
           <w:p>
             <w:pPr>
-              <w:keepLines/>
-              <w:spacing w:after="0" w:before="0" w:line="276" w:lineRule="auto"/>
+              <w:spacing w:after="0"/>
             </w:pPr>
           </w:p>
         </w:tc>
@@ -26627,8 +26610,7 @@
           </w:tcPr>
           <w:p>
             <w:pPr>
-              <w:keepLines/>
-              <w:spacing w:after="0" w:before="0" w:line="276" w:lineRule="auto"/>
+              <w:spacing w:after="0"/>
             </w:pPr>
           </w:p>
         </w:tc>
@@ -26676,8 +26658,7 @@
           </w:tcPr>
           <w:p>
             <w:pPr>
-              <w:keepLines/>
-              <w:spacing w:after="0" w:before="0" w:line="276" w:lineRule="auto"/>
+              <w:spacing w:after="0"/>
             </w:pPr>
           </w:p>
         </w:tc>
@@ -26816,8 +26797,7 @@
           </w:tcPr>
           <w:p>
             <w:pPr>
-              <w:keepLines/>
-              <w:spacing w:after="0" w:before="0" w:line="276" w:lineRule="auto"/>
+              <w:spacing w:after="0"/>
             </w:pPr>
           </w:p>
         </w:tc>
@@ -27031,8 +27011,7 @@
           </w:tcPr>
           <w:p>
             <w:pPr>
-              <w:keepLines/>
-              <w:spacing w:after="0" w:before="0" w:line="276" w:lineRule="auto"/>
+              <w:spacing w:after="0"/>
             </w:pPr>
           </w:p>
         </w:tc>
@@ -27080,8 +27059,7 @@
           </w:tcPr>
           <w:p>
             <w:pPr>
-              <w:keepLines/>
-              <w:spacing w:after="0" w:before="0" w:line="276" w:lineRule="auto"/>
+              <w:spacing w:after="0"/>
             </w:pPr>
           </w:p>
         </w:tc>
@@ -27450,8 +27428,7 @@
     </w:tbl>
     <w:p>
       <w:pPr>
-        <w:keepLines/>
-        <w:spacing w:after="0" w:before="60" w:line="276" w:lineRule="auto"/>
+        <w:spacing w:after="0" w:before="60"/>
       </w:pPr>
       <w:r>
         <w:rPr>
@@ -27460,7 +27437,16 @@
           <w:sz w:val="17"/>
           <w:szCs w:val="17"/>
         </w:rPr>
-        <w:t xml:space="preserve">Outro / detalhe: ________________________________________________</w:t>
+        <w:t xml:space="preserve">Outro / detalhe: </w:t>
+      </w:r>
+      <w:r>
+        <w:rPr>
+          <w:rFonts w:ascii="Google Sans" w:cs="Google Sans" w:eastAsia="Google Sans" w:hAnsi="Google Sans"/>
+          <w:color w:val="5B6384"/>
+          <w:sz w:val="17"/>
+          <w:szCs w:val="17"/>
+        </w:rPr>
+        <w:t xml:space="preserve">________________________________________________</w:t>
       </w:r>
     </w:p>
     <w:p>
@@ -27596,8 +27582,7 @@
           </w:tcPr>
           <w:p>
             <w:pPr>
-              <w:keepLines/>
-              <w:spacing w:after="0" w:before="0" w:line="276" w:lineRule="auto"/>
+              <w:spacing w:after="0"/>
             </w:pPr>
           </w:p>
         </w:tc>
@@ -28428,8 +28413,7 @@
           </w:tcPr>
           <w:p>
             <w:pPr>
-              <w:keepLines/>
-              <w:spacing w:after="0" w:before="0" w:line="276" w:lineRule="auto"/>
+              <w:spacing w:after="0"/>
             </w:pPr>
           </w:p>
         </w:tc>
@@ -29353,8 +29337,7 @@
           </w:tcPr>
           <w:p>
             <w:pPr>
-              <w:keepLines/>
-              <w:spacing w:after="0" w:before="0" w:line="276" w:lineRule="auto"/>
+              <w:spacing w:after="0"/>
             </w:pPr>
           </w:p>
         </w:tc>
@@ -29663,8 +29646,7 @@
           </w:tcPr>
           <w:p>
             <w:pPr>
-              <w:keepLines/>
-              <w:spacing w:after="0" w:before="0" w:line="276" w:lineRule="auto"/>
+              <w:spacing w:after="0"/>
             </w:pPr>
           </w:p>
         </w:tc>
@@ -30169,8 +30151,7 @@
           </w:tcPr>
           <w:p>
             <w:pPr>
-              <w:keepLines/>
-              <w:spacing w:after="0" w:before="0" w:line="276" w:lineRule="auto"/>
+              <w:spacing w:after="0"/>
             </w:pPr>
           </w:p>
         </w:tc>
@@ -30281,8 +30262,7 @@
           </w:tcPr>
           <w:p>
             <w:pPr>
-              <w:keepLines/>
-              <w:spacing w:after="0" w:before="0" w:line="276" w:lineRule="auto"/>
+              <w:spacing w:after="0"/>
             </w:pPr>
           </w:p>
         </w:tc>
@@ -30713,8 +30693,7 @@
           </w:tcPr>
           <w:p>
             <w:pPr>
-              <w:keepLines/>
-              <w:spacing w:after="0" w:before="0" w:line="276" w:lineRule="auto"/>
+              <w:spacing w:after="0"/>
             </w:pPr>
           </w:p>
         </w:tc>
@@ -30762,8 +30741,7 @@
           </w:tcPr>
           <w:p>
             <w:pPr>
-              <w:keepLines/>
-              <w:spacing w:after="0" w:before="0" w:line="276" w:lineRule="auto"/>
+              <w:spacing w:after="0"/>
             </w:pPr>
           </w:p>
         </w:tc>
@@ -31610,8 +31588,7 @@
           </w:tcPr>
           <w:p>
             <w:pPr>
-              <w:keepLines/>
-              <w:spacing w:after="0" w:before="0" w:line="276" w:lineRule="auto"/>
+              <w:spacing w:after="0"/>
             </w:pPr>
           </w:p>
         </w:tc>
@@ -31694,8 +31671,7 @@
           </w:tcPr>
           <w:p>
             <w:pPr>
-              <w:keepLines/>
-              <w:spacing w:after="0" w:before="0" w:line="276" w:lineRule="auto"/>
+              <w:spacing w:after="0"/>
             </w:pPr>
           </w:p>
         </w:tc>
@@ -32982,8 +32958,7 @@
     </w:p>
     <w:p>
       <w:pPr>
-        <w:keepLines/>
-        <w:spacing w:after="120" w:before="0" w:line="276" w:lineRule="auto"/>
+        <w:spacing w:after="120"/>
       </w:pPr>
       <w:r>
         <w:rPr>
@@ -32992,7 +32967,52 @@
           <w:sz w:val="17"/>
           <w:szCs w:val="17"/>
         </w:rPr>
-        <w:t xml:space="preserve">Respondente nº ______     Data da entrevista ____/____/______     Entrevistador(a) ___________________________</w:t>
+        <w:t xml:space="preserve">Respondente nº </w:t>
+      </w:r>
+      <w:r>
+        <w:rPr>
+          <w:rFonts w:ascii="Google Sans" w:cs="Google Sans" w:eastAsia="Google Sans" w:hAnsi="Google Sans"/>
+          <w:color w:val="5B6384"/>
+          <w:sz w:val="17"/>
+          <w:szCs w:val="17"/>
+        </w:rPr>
+        <w:t xml:space="preserve">________</w:t>
+      </w:r>
+      <w:r>
+        <w:rPr>
+          <w:rFonts w:ascii="Google Sans" w:cs="Google Sans" w:eastAsia="Google Sans" w:hAnsi="Google Sans"/>
+          <w:color w:val="5B6384"/>
+          <w:sz w:val="17"/>
+          <w:szCs w:val="17"/>
+        </w:rPr>
+        <w:t xml:space="preserve">     Data da entrevista </w:t>
+      </w:r>
+      <w:r>
+        <w:rPr>
+          <w:rFonts w:ascii="Google Sans" w:cs="Google Sans" w:eastAsia="Google Sans" w:hAnsi="Google Sans"/>
+          <w:color w:val="5B6384"/>
+          <w:sz w:val="17"/>
+          <w:szCs w:val="17"/>
+        </w:rPr>
+        <w:t xml:space="preserve">________________</w:t>
+      </w:r>
+      <w:r>
+        <w:rPr>
+          <w:rFonts w:ascii="Google Sans" w:cs="Google Sans" w:eastAsia="Google Sans" w:hAnsi="Google Sans"/>
+          <w:color w:val="5B6384"/>
+          <w:sz w:val="17"/>
+          <w:szCs w:val="17"/>
+        </w:rPr>
+        <w:t xml:space="preserve">     Entrevistador(a) </w:t>
+      </w:r>
+      <w:r>
+        <w:rPr>
+          <w:rFonts w:ascii="Google Sans" w:cs="Google Sans" w:eastAsia="Google Sans" w:hAnsi="Google Sans"/>
+          <w:color w:val="5B6384"/>
+          <w:sz w:val="17"/>
+          <w:szCs w:val="17"/>
+        </w:rPr>
+        <w:t xml:space="preserve">___________________________</w:t>
       </w:r>
     </w:p>
     <w:p>
@@ -33187,8 +33207,7 @@
           </w:tcPr>
           <w:p>
             <w:pPr>
-              <w:keepLines/>
-              <w:spacing w:after="0" w:before="0" w:line="276" w:lineRule="auto"/>
+              <w:spacing w:after="0"/>
             </w:pPr>
           </w:p>
         </w:tc>
@@ -33236,8 +33255,7 @@
           </w:tcPr>
           <w:p>
             <w:pPr>
-              <w:keepLines/>
-              <w:spacing w:after="0" w:before="0" w:line="276" w:lineRule="auto"/>
+              <w:spacing w:after="0"/>
             </w:pPr>
           </w:p>
         </w:tc>
@@ -33423,8 +33441,7 @@
           </w:tcPr>
           <w:p>
             <w:pPr>
-              <w:keepLines/>
-              <w:spacing w:after="0" w:before="0" w:line="276" w:lineRule="auto"/>
+              <w:spacing w:after="0"/>
             </w:pPr>
           </w:p>
         </w:tc>
@@ -33472,8 +33489,7 @@
           </w:tcPr>
           <w:p>
             <w:pPr>
-              <w:keepLines/>
-              <w:spacing w:after="0" w:before="0" w:line="276" w:lineRule="auto"/>
+              <w:spacing w:after="0"/>
             </w:pPr>
           </w:p>
         </w:tc>
@@ -33907,8 +33923,7 @@
           </w:tcPr>
           <w:p>
             <w:pPr>
-              <w:keepLines/>
-              <w:spacing w:after="0" w:before="0" w:line="276" w:lineRule="auto"/>
+              <w:spacing w:after="0"/>
               <w:jc w:val="center"/>
             </w:pPr>
             <w:r>
@@ -33942,8 +33957,7 @@
           </w:tcPr>
           <w:p>
             <w:pPr>
-              <w:keepLines/>
-              <w:spacing w:after="0" w:before="0" w:line="276" w:lineRule="auto"/>
+              <w:spacing w:after="0"/>
               <w:jc w:val="center"/>
             </w:pPr>
             <w:r>
@@ -33977,8 +33991,7 @@
           </w:tcPr>
           <w:p>
             <w:pPr>
-              <w:keepLines/>
-              <w:spacing w:after="0" w:before="0" w:line="276" w:lineRule="auto"/>
+              <w:spacing w:after="0"/>
               <w:jc w:val="center"/>
             </w:pPr>
             <w:r>
@@ -34012,8 +34025,7 @@
           </w:tcPr>
           <w:p>
             <w:pPr>
-              <w:keepLines/>
-              <w:spacing w:after="0" w:before="0" w:line="276" w:lineRule="auto"/>
+              <w:spacing w:after="0"/>
               <w:jc w:val="center"/>
             </w:pPr>
             <w:r>
@@ -34047,8 +34059,7 @@
           </w:tcPr>
           <w:p>
             <w:pPr>
-              <w:keepLines/>
-              <w:spacing w:after="0" w:before="0" w:line="276" w:lineRule="auto"/>
+              <w:spacing w:after="0"/>
               <w:jc w:val="center"/>
             </w:pPr>
             <w:r>
@@ -34131,8 +34142,7 @@
           </w:tcPr>
           <w:p>
             <w:pPr>
-              <w:keepLines/>
-              <w:spacing w:after="0" w:before="0" w:line="276" w:lineRule="auto"/>
+              <w:spacing w:after="0"/>
               <w:jc w:val="center"/>
             </w:pPr>
             <w:r>
@@ -34166,8 +34176,7 @@
           </w:tcPr>
           <w:p>
             <w:pPr>
-              <w:keepLines/>
-              <w:spacing w:after="0" w:before="0" w:line="276" w:lineRule="auto"/>
+              <w:spacing w:after="0"/>
               <w:jc w:val="center"/>
             </w:pPr>
             <w:r>
@@ -34201,8 +34210,7 @@
           </w:tcPr>
           <w:p>
             <w:pPr>
-              <w:keepLines/>
-              <w:spacing w:after="0" w:before="0" w:line="276" w:lineRule="auto"/>
+              <w:spacing w:after="0"/>
               <w:jc w:val="center"/>
             </w:pPr>
             <w:r>
@@ -34236,8 +34244,7 @@
           </w:tcPr>
           <w:p>
             <w:pPr>
-              <w:keepLines/>
-              <w:spacing w:after="0" w:before="0" w:line="276" w:lineRule="auto"/>
+              <w:spacing w:after="0"/>
               <w:jc w:val="center"/>
             </w:pPr>
             <w:r>
@@ -34271,8 +34278,7 @@
           </w:tcPr>
           <w:p>
             <w:pPr>
-              <w:keepLines/>
-              <w:spacing w:after="0" w:before="0" w:line="276" w:lineRule="auto"/>
+              <w:spacing w:after="0"/>
               <w:jc w:val="center"/>
             </w:pPr>
             <w:r>
@@ -34355,8 +34361,7 @@
           </w:tcPr>
           <w:p>
             <w:pPr>
-              <w:keepLines/>
-              <w:spacing w:after="0" w:before="0" w:line="276" w:lineRule="auto"/>
+              <w:spacing w:after="0"/>
               <w:jc w:val="center"/>
             </w:pPr>
             <w:r>
@@ -34390,8 +34395,7 @@
           </w:tcPr>
           <w:p>
             <w:pPr>
-              <w:keepLines/>
-              <w:spacing w:after="0" w:before="0" w:line="276" w:lineRule="auto"/>
+              <w:spacing w:after="0"/>
               <w:jc w:val="center"/>
             </w:pPr>
             <w:r>
@@ -34425,8 +34429,7 @@
           </w:tcPr>
           <w:p>
             <w:pPr>
-              <w:keepLines/>
-              <w:spacing w:after="0" w:before="0" w:line="276" w:lineRule="auto"/>
+              <w:spacing w:after="0"/>
               <w:jc w:val="center"/>
             </w:pPr>
             <w:r>
@@ -34460,8 +34463,7 @@
           </w:tcPr>
           <w:p>
             <w:pPr>
-              <w:keepLines/>
-              <w:spacing w:after="0" w:before="0" w:line="276" w:lineRule="auto"/>
+              <w:spacing w:after="0"/>
               <w:jc w:val="center"/>
             </w:pPr>
             <w:r>
@@ -34495,8 +34497,7 @@
           </w:tcPr>
           <w:p>
             <w:pPr>
-              <w:keepLines/>
-              <w:spacing w:after="0" w:before="0" w:line="276" w:lineRule="auto"/>
+              <w:spacing w:after="0"/>
               <w:jc w:val="center"/>
             </w:pPr>
             <w:r>
@@ -34579,8 +34580,7 @@
           </w:tcPr>
           <w:p>
             <w:pPr>
-              <w:keepLines/>
-              <w:spacing w:after="0" w:before="0" w:line="276" w:lineRule="auto"/>
+              <w:spacing w:after="0"/>
               <w:jc w:val="center"/>
             </w:pPr>
             <w:r>
@@ -34614,8 +34614,7 @@
           </w:tcPr>
           <w:p>
             <w:pPr>
-              <w:keepLines/>
-              <w:spacing w:after="0" w:before="0" w:line="276" w:lineRule="auto"/>
+              <w:spacing w:after="0"/>
               <w:jc w:val="center"/>
             </w:pPr>
             <w:r>
@@ -34649,8 +34648,7 @@
           </w:tcPr>
           <w:p>
             <w:pPr>
-              <w:keepLines/>
-              <w:spacing w:after="0" w:before="0" w:line="276" w:lineRule="auto"/>
+              <w:spacing w:after="0"/>
               <w:jc w:val="center"/>
             </w:pPr>
             <w:r>
@@ -34684,8 +34682,7 @@
           </w:tcPr>
           <w:p>
             <w:pPr>
-              <w:keepLines/>
-              <w:spacing w:after="0" w:before="0" w:line="276" w:lineRule="auto"/>
+              <w:spacing w:after="0"/>
               <w:jc w:val="center"/>
             </w:pPr>
             <w:r>
@@ -34719,8 +34716,7 @@
           </w:tcPr>
           <w:p>
             <w:pPr>
-              <w:keepLines/>
-              <w:spacing w:after="0" w:before="0" w:line="276" w:lineRule="auto"/>
+              <w:spacing w:after="0"/>
               <w:jc w:val="center"/>
             </w:pPr>
             <w:r>
@@ -34803,8 +34799,7 @@
           </w:tcPr>
           <w:p>
             <w:pPr>
-              <w:keepLines/>
-              <w:spacing w:after="0" w:before="0" w:line="276" w:lineRule="auto"/>
+              <w:spacing w:after="0"/>
               <w:jc w:val="center"/>
             </w:pPr>
             <w:r>
@@ -34838,8 +34833,7 @@
           </w:tcPr>
           <w:p>
             <w:pPr>
-              <w:keepLines/>
-              <w:spacing w:after="0" w:before="0" w:line="276" w:lineRule="auto"/>
+              <w:spacing w:after="0"/>
               <w:jc w:val="center"/>
             </w:pPr>
             <w:r>
@@ -34873,8 +34867,7 @@
           </w:tcPr>
           <w:p>
             <w:pPr>
-              <w:keepLines/>
-              <w:spacing w:after="0" w:before="0" w:line="276" w:lineRule="auto"/>
+              <w:spacing w:after="0"/>
               <w:jc w:val="center"/>
             </w:pPr>
             <w:r>
@@ -34908,8 +34901,7 @@
           </w:tcPr>
           <w:p>
             <w:pPr>
-              <w:keepLines/>
-              <w:spacing w:after="0" w:before="0" w:line="276" w:lineRule="auto"/>
+              <w:spacing w:after="0"/>
               <w:jc w:val="center"/>
             </w:pPr>
             <w:r>
@@ -34943,8 +34935,7 @@
           </w:tcPr>
           <w:p>
             <w:pPr>
-              <w:keepLines/>
-              <w:spacing w:after="0" w:before="0" w:line="276" w:lineRule="auto"/>
+              <w:spacing w:after="0"/>
               <w:jc w:val="center"/>
             </w:pPr>
             <w:r>
@@ -35027,8 +35018,7 @@
           </w:tcPr>
           <w:p>
             <w:pPr>
-              <w:keepLines/>
-              <w:spacing w:after="0" w:before="0" w:line="276" w:lineRule="auto"/>
+              <w:spacing w:after="0"/>
               <w:jc w:val="center"/>
             </w:pPr>
             <w:r>
@@ -35062,8 +35052,7 @@
           </w:tcPr>
           <w:p>
             <w:pPr>
-              <w:keepLines/>
-              <w:spacing w:after="0" w:before="0" w:line="276" w:lineRule="auto"/>
+              <w:spacing w:after="0"/>
               <w:jc w:val="center"/>
             </w:pPr>
             <w:r>
@@ -35097,8 +35086,7 @@
           </w:tcPr>
           <w:p>
             <w:pPr>
-              <w:keepLines/>
-              <w:spacing w:after="0" w:before="0" w:line="276" w:lineRule="auto"/>
+              <w:spacing w:after="0"/>
               <w:jc w:val="center"/>
             </w:pPr>
             <w:r>
@@ -35132,8 +35120,7 @@
           </w:tcPr>
           <w:p>
             <w:pPr>
-              <w:keepLines/>
-              <w:spacing w:after="0" w:before="0" w:line="276" w:lineRule="auto"/>
+              <w:spacing w:after="0"/>
               <w:jc w:val="center"/>
             </w:pPr>
             <w:r>
@@ -35167,8 +35154,7 @@
           </w:tcPr>
           <w:p>
             <w:pPr>
-              <w:keepLines/>
-              <w:spacing w:after="0" w:before="0" w:line="276" w:lineRule="auto"/>
+              <w:spacing w:after="0"/>
               <w:jc w:val="center"/>
             </w:pPr>
             <w:r>
@@ -35251,8 +35237,7 @@
           </w:tcPr>
           <w:p>
             <w:pPr>
-              <w:keepLines/>
-              <w:spacing w:after="0" w:before="0" w:line="276" w:lineRule="auto"/>
+              <w:spacing w:after="0"/>
               <w:jc w:val="center"/>
             </w:pPr>
             <w:r>
@@ -35286,8 +35271,7 @@
           </w:tcPr>
           <w:p>
             <w:pPr>
-              <w:keepLines/>
-              <w:spacing w:after="0" w:before="0" w:line="276" w:lineRule="auto"/>
+              <w:spacing w:after="0"/>
               <w:jc w:val="center"/>
             </w:pPr>
             <w:r>
@@ -35321,8 +35305,7 @@
           </w:tcPr>
           <w:p>
             <w:pPr>
-              <w:keepLines/>
-              <w:spacing w:after="0" w:before="0" w:line="276" w:lineRule="auto"/>
+              <w:spacing w:after="0"/>
               <w:jc w:val="center"/>
             </w:pPr>
             <w:r>
@@ -35356,8 +35339,7 @@
           </w:tcPr>
           <w:p>
             <w:pPr>
-              <w:keepLines/>
-              <w:spacing w:after="0" w:before="0" w:line="276" w:lineRule="auto"/>
+              <w:spacing w:after="0"/>
               <w:jc w:val="center"/>
             </w:pPr>
             <w:r>
@@ -35391,8 +35373,7 @@
           </w:tcPr>
           <w:p>
             <w:pPr>
-              <w:keepLines/>
-              <w:spacing w:after="0" w:before="0" w:line="276" w:lineRule="auto"/>
+              <w:spacing w:after="0"/>
               <w:jc w:val="center"/>
             </w:pPr>
             <w:r>
@@ -35475,8 +35456,7 @@
           </w:tcPr>
           <w:p>
             <w:pPr>
-              <w:keepLines/>
-              <w:spacing w:after="0" w:before="0" w:line="276" w:lineRule="auto"/>
+              <w:spacing w:after="0"/>
               <w:jc w:val="center"/>
             </w:pPr>
             <w:r>
@@ -35510,8 +35490,7 @@
           </w:tcPr>
           <w:p>
             <w:pPr>
-              <w:keepLines/>
-              <w:spacing w:after="0" w:before="0" w:line="276" w:lineRule="auto"/>
+              <w:spacing w:after="0"/>
               <w:jc w:val="center"/>
             </w:pPr>
             <w:r>
@@ -35545,8 +35524,7 @@
           </w:tcPr>
           <w:p>
             <w:pPr>
-              <w:keepLines/>
-              <w:spacing w:after="0" w:before="0" w:line="276" w:lineRule="auto"/>
+              <w:spacing w:after="0"/>
               <w:jc w:val="center"/>
             </w:pPr>
             <w:r>
@@ -35580,8 +35558,7 @@
           </w:tcPr>
           <w:p>
             <w:pPr>
-              <w:keepLines/>
-              <w:spacing w:after="0" w:before="0" w:line="276" w:lineRule="auto"/>
+              <w:spacing w:after="0"/>
               <w:jc w:val="center"/>
             </w:pPr>
             <w:r>
@@ -35615,8 +35592,7 @@
           </w:tcPr>
           <w:p>
             <w:pPr>
-              <w:keepLines/>
-              <w:spacing w:after="0" w:before="0" w:line="276" w:lineRule="auto"/>
+              <w:spacing w:after="0"/>
               <w:jc w:val="center"/>
             </w:pPr>
             <w:r>
@@ -36045,8 +36021,7 @@
           </w:tcPr>
           <w:p>
             <w:pPr>
-              <w:keepLines/>
-              <w:spacing w:after="0" w:before="0" w:line="276" w:lineRule="auto"/>
+              <w:spacing w:after="0"/>
               <w:jc w:val="center"/>
             </w:pPr>
             <w:r>
@@ -36080,8 +36055,7 @@
           </w:tcPr>
           <w:p>
             <w:pPr>
-              <w:keepLines/>
-              <w:spacing w:after="0" w:before="0" w:line="276" w:lineRule="auto"/>
+              <w:spacing w:after="0"/>
               <w:jc w:val="center"/>
             </w:pPr>
             <w:r>
@@ -36115,8 +36089,7 @@
           </w:tcPr>
           <w:p>
             <w:pPr>
-              <w:keepLines/>
-              <w:spacing w:after="0" w:before="0" w:line="276" w:lineRule="auto"/>
+              <w:spacing w:after="0"/>
               <w:jc w:val="center"/>
             </w:pPr>
             <w:r>
@@ -36150,8 +36123,7 @@
           </w:tcPr>
           <w:p>
             <w:pPr>
-              <w:keepLines/>
-              <w:spacing w:after="0" w:before="0" w:line="276" w:lineRule="auto"/>
+              <w:spacing w:after="0"/>
               <w:jc w:val="center"/>
             </w:pPr>
             <w:r>
@@ -36185,8 +36157,7 @@
           </w:tcPr>
           <w:p>
             <w:pPr>
-              <w:keepLines/>
-              <w:spacing w:after="0" w:before="0" w:line="276" w:lineRule="auto"/>
+              <w:spacing w:after="0"/>
               <w:jc w:val="center"/>
             </w:pPr>
             <w:r>
@@ -36269,8 +36240,7 @@
           </w:tcPr>
           <w:p>
             <w:pPr>
-              <w:keepLines/>
-              <w:spacing w:after="0" w:before="0" w:line="276" w:lineRule="auto"/>
+              <w:spacing w:after="0"/>
               <w:jc w:val="center"/>
             </w:pPr>
             <w:r>
@@ -36304,8 +36274,7 @@
           </w:tcPr>
           <w:p>
             <w:pPr>
-              <w:keepLines/>
-              <w:spacing w:after="0" w:before="0" w:line="276" w:lineRule="auto"/>
+              <w:spacing w:after="0"/>
               <w:jc w:val="center"/>
             </w:pPr>
             <w:r>
@@ -36339,8 +36308,7 @@
           </w:tcPr>
           <w:p>
             <w:pPr>
-              <w:keepLines/>
-              <w:spacing w:after="0" w:before="0" w:line="276" w:lineRule="auto"/>
+              <w:spacing w:after="0"/>
               <w:jc w:val="center"/>
             </w:pPr>
             <w:r>
@@ -36374,8 +36342,7 @@
           </w:tcPr>
           <w:p>
             <w:pPr>
-              <w:keepLines/>
-              <w:spacing w:after="0" w:before="0" w:line="276" w:lineRule="auto"/>
+              <w:spacing w:after="0"/>
               <w:jc w:val="center"/>
             </w:pPr>
             <w:r>
@@ -36409,8 +36376,7 @@
           </w:tcPr>
           <w:p>
             <w:pPr>
-              <w:keepLines/>
-              <w:spacing w:after="0" w:before="0" w:line="276" w:lineRule="auto"/>
+              <w:spacing w:after="0"/>
               <w:jc w:val="center"/>
             </w:pPr>
             <w:r>
@@ -36493,8 +36459,7 @@
           </w:tcPr>
           <w:p>
             <w:pPr>
-              <w:keepLines/>
-              <w:spacing w:after="0" w:before="0" w:line="276" w:lineRule="auto"/>
+              <w:spacing w:after="0"/>
               <w:jc w:val="center"/>
             </w:pPr>
             <w:r>
@@ -36528,8 +36493,7 @@
           </w:tcPr>
           <w:p>
             <w:pPr>
-              <w:keepLines/>
-              <w:spacing w:after="0" w:before="0" w:line="276" w:lineRule="auto"/>
+              <w:spacing w:after="0"/>
               <w:jc w:val="center"/>
             </w:pPr>
             <w:r>
@@ -36563,8 +36527,7 @@
           </w:tcPr>
           <w:p>
             <w:pPr>
-              <w:keepLines/>
-              <w:spacing w:after="0" w:before="0" w:line="276" w:lineRule="auto"/>
+              <w:spacing w:after="0"/>
               <w:jc w:val="center"/>
             </w:pPr>
             <w:r>
@@ -36598,8 +36561,7 @@
           </w:tcPr>
           <w:p>
             <w:pPr>
-              <w:keepLines/>
-              <w:spacing w:after="0" w:before="0" w:line="276" w:lineRule="auto"/>
+              <w:spacing w:after="0"/>
               <w:jc w:val="center"/>
             </w:pPr>
             <w:r>
@@ -36633,8 +36595,7 @@
           </w:tcPr>
           <w:p>
             <w:pPr>
-              <w:keepLines/>
-              <w:spacing w:after="0" w:before="0" w:line="276" w:lineRule="auto"/>
+              <w:spacing w:after="0"/>
               <w:jc w:val="center"/>
             </w:pPr>
             <w:r>
@@ -36717,8 +36678,7 @@
           </w:tcPr>
           <w:p>
             <w:pPr>
-              <w:keepLines/>
-              <w:spacing w:after="0" w:before="0" w:line="276" w:lineRule="auto"/>
+              <w:spacing w:after="0"/>
               <w:jc w:val="center"/>
             </w:pPr>
             <w:r>
@@ -36752,8 +36712,7 @@
           </w:tcPr>
           <w:p>
             <w:pPr>
-              <w:keepLines/>
-              <w:spacing w:after="0" w:before="0" w:line="276" w:lineRule="auto"/>
+              <w:spacing w:after="0"/>
               <w:jc w:val="center"/>
             </w:pPr>
             <w:r>
@@ -36787,8 +36746,7 @@
           </w:tcPr>
           <w:p>
             <w:pPr>
-              <w:keepLines/>
-              <w:spacing w:after="0" w:before="0" w:line="276" w:lineRule="auto"/>
+              <w:spacing w:after="0"/>
               <w:jc w:val="center"/>
             </w:pPr>
             <w:r>
@@ -36822,8 +36780,7 @@
           </w:tcPr>
           <w:p>
             <w:pPr>
-              <w:keepLines/>
-              <w:spacing w:after="0" w:before="0" w:line="276" w:lineRule="auto"/>
+              <w:spacing w:after="0"/>
               <w:jc w:val="center"/>
             </w:pPr>
             <w:r>
@@ -36857,8 +36814,7 @@
           </w:tcPr>
           <w:p>
             <w:pPr>
-              <w:keepLines/>
-              <w:spacing w:after="0" w:before="0" w:line="276" w:lineRule="auto"/>
+              <w:spacing w:after="0"/>
               <w:jc w:val="center"/>
             </w:pPr>
             <w:r>
@@ -36941,8 +36897,7 @@
           </w:tcPr>
           <w:p>
             <w:pPr>
-              <w:keepLines/>
-              <w:spacing w:after="0" w:before="0" w:line="276" w:lineRule="auto"/>
+              <w:spacing w:after="0"/>
               <w:jc w:val="center"/>
             </w:pPr>
             <w:r>
@@ -36976,8 +36931,7 @@
           </w:tcPr>
           <w:p>
             <w:pPr>
-              <w:keepLines/>
-              <w:spacing w:after="0" w:before="0" w:line="276" w:lineRule="auto"/>
+              <w:spacing w:after="0"/>
               <w:jc w:val="center"/>
             </w:pPr>
             <w:r>
@@ -37011,8 +36965,7 @@
           </w:tcPr>
           <w:p>
             <w:pPr>
-              <w:keepLines/>
-              <w:spacing w:after="0" w:before="0" w:line="276" w:lineRule="auto"/>
+              <w:spacing w:after="0"/>
               <w:jc w:val="center"/>
             </w:pPr>
             <w:r>
@@ -37046,8 +36999,7 @@
           </w:tcPr>
           <w:p>
             <w:pPr>
-              <w:keepLines/>
-              <w:spacing w:after="0" w:before="0" w:line="276" w:lineRule="auto"/>
+              <w:spacing w:after="0"/>
               <w:jc w:val="center"/>
             </w:pPr>
             <w:r>
@@ -37081,8 +37033,7 @@
           </w:tcPr>
           <w:p>
             <w:pPr>
-              <w:keepLines/>
-              <w:spacing w:after="0" w:before="0" w:line="276" w:lineRule="auto"/>
+              <w:spacing w:after="0"/>
               <w:jc w:val="center"/>
             </w:pPr>
             <w:r>
@@ -37165,8 +37116,7 @@
           </w:tcPr>
           <w:p>
             <w:pPr>
-              <w:keepLines/>
-              <w:spacing w:after="0" w:before="0" w:line="276" w:lineRule="auto"/>
+              <w:spacing w:after="0"/>
               <w:jc w:val="center"/>
             </w:pPr>
             <w:r>
@@ -37200,8 +37150,7 @@
           </w:tcPr>
           <w:p>
             <w:pPr>
-              <w:keepLines/>
-              <w:spacing w:after="0" w:before="0" w:line="276" w:lineRule="auto"/>
+              <w:spacing w:after="0"/>
               <w:jc w:val="center"/>
             </w:pPr>
             <w:r>
@@ -37235,8 +37184,7 @@
           </w:tcPr>
           <w:p>
             <w:pPr>
-              <w:keepLines/>
-              <w:spacing w:after="0" w:before="0" w:line="276" w:lineRule="auto"/>
+              <w:spacing w:after="0"/>
               <w:jc w:val="center"/>
             </w:pPr>
             <w:r>
@@ -37270,8 +37218,7 @@
           </w:tcPr>
           <w:p>
             <w:pPr>
-              <w:keepLines/>
-              <w:spacing w:after="0" w:before="0" w:line="276" w:lineRule="auto"/>
+              <w:spacing w:after="0"/>
               <w:jc w:val="center"/>
             </w:pPr>
             <w:r>
@@ -37305,8 +37252,7 @@
           </w:tcPr>
           <w:p>
             <w:pPr>
-              <w:keepLines/>
-              <w:spacing w:after="0" w:before="0" w:line="276" w:lineRule="auto"/>
+              <w:spacing w:after="0"/>
               <w:jc w:val="center"/>
             </w:pPr>
             <w:r>
@@ -37389,8 +37335,7 @@
           </w:tcPr>
           <w:p>
             <w:pPr>
-              <w:keepLines/>
-              <w:spacing w:after="0" w:before="0" w:line="276" w:lineRule="auto"/>
+              <w:spacing w:after="0"/>
               <w:jc w:val="center"/>
             </w:pPr>
             <w:r>
@@ -37424,8 +37369,7 @@
           </w:tcPr>
           <w:p>
             <w:pPr>
-              <w:keepLines/>
-              <w:spacing w:after="0" w:before="0" w:line="276" w:lineRule="auto"/>
+              <w:spacing w:after="0"/>
               <w:jc w:val="center"/>
             </w:pPr>
             <w:r>
@@ -37459,8 +37403,7 @@
           </w:tcPr>
           <w:p>
             <w:pPr>
-              <w:keepLines/>
-              <w:spacing w:after="0" w:before="0" w:line="276" w:lineRule="auto"/>
+              <w:spacing w:after="0"/>
               <w:jc w:val="center"/>
             </w:pPr>
             <w:r>
@@ -37494,8 +37437,7 @@
           </w:tcPr>
           <w:p>
             <w:pPr>
-              <w:keepLines/>
-              <w:spacing w:after="0" w:before="0" w:line="276" w:lineRule="auto"/>
+              <w:spacing w:after="0"/>
               <w:jc w:val="center"/>
             </w:pPr>
             <w:r>
@@ -37529,8 +37471,7 @@
           </w:tcPr>
           <w:p>
             <w:pPr>
-              <w:keepLines/>
-              <w:spacing w:after="0" w:before="0" w:line="276" w:lineRule="auto"/>
+              <w:spacing w:after="0"/>
               <w:jc w:val="center"/>
             </w:pPr>
             <w:r>
@@ -37618,8 +37559,7 @@
           </w:tcPr>
           <w:p>
             <w:pPr>
-              <w:keepLines/>
-              <w:spacing w:after="0" w:before="0" w:line="276" w:lineRule="auto"/>
+              <w:spacing w:after="0"/>
             </w:pPr>
           </w:p>
         </w:tc>
@@ -37714,8 +37654,7 @@
           </w:tcPr>
           <w:p>
             <w:pPr>
-              <w:keepLines/>
-              <w:spacing w:after="0" w:before="0" w:line="276" w:lineRule="auto"/>
+              <w:spacing w:after="0"/>
             </w:pPr>
           </w:p>
         </w:tc>
@@ -37820,8 +37759,7 @@
           </w:tcPr>
           <w:p>
             <w:pPr>
-              <w:keepLines/>
-              <w:spacing w:after="0" w:before="0" w:line="276" w:lineRule="auto"/>
+              <w:spacing w:after="0"/>
             </w:pPr>
           </w:p>
         </w:tc>
@@ -37899,8 +37837,7 @@
           </w:tcPr>
           <w:p>
             <w:pPr>
-              <w:keepLines/>
-              <w:spacing w:after="0" w:before="0" w:line="276" w:lineRule="auto"/>
+              <w:spacing w:after="0"/>
             </w:pPr>
           </w:p>
         </w:tc>
@@ -37978,8 +37915,7 @@
           </w:tcPr>
           <w:p>
             <w:pPr>
-              <w:keepLines/>
-              <w:spacing w:after="0" w:before="0" w:line="276" w:lineRule="auto"/>
+              <w:spacing w:after="0"/>
             </w:pPr>
           </w:p>
         </w:tc>
@@ -38057,8 +37993,7 @@
           </w:tcPr>
           <w:p>
             <w:pPr>
-              <w:keepLines/>
-              <w:spacing w:after="0" w:before="0" w:line="276" w:lineRule="auto"/>
+              <w:spacing w:after="0"/>
             </w:pPr>
           </w:p>
         </w:tc>
@@ -38136,8 +38071,7 @@
           </w:tcPr>
           <w:p>
             <w:pPr>
-              <w:keepLines/>
-              <w:spacing w:after="0" w:before="0" w:line="276" w:lineRule="auto"/>
+              <w:spacing w:after="0"/>
             </w:pPr>
           </w:p>
         </w:tc>
@@ -38232,8 +38166,7 @@
           </w:tcPr>
           <w:p>
             <w:pPr>
-              <w:keepLines/>
-              <w:spacing w:after="0" w:before="0" w:line="276" w:lineRule="auto"/>
+              <w:spacing w:after="0"/>
             </w:pPr>
           </w:p>
         </w:tc>
@@ -38311,8 +38244,7 @@
           </w:tcPr>
           <w:p>
             <w:pPr>
-              <w:keepLines/>
-              <w:spacing w:after="0" w:before="0" w:line="276" w:lineRule="auto"/>
+              <w:spacing w:after="0"/>
             </w:pPr>
           </w:p>
         </w:tc>
@@ -38390,8 +38322,7 @@
           </w:tcPr>
           <w:p>
             <w:pPr>
-              <w:keepLines/>
-              <w:spacing w:after="0" w:before="0" w:line="276" w:lineRule="auto"/>
+              <w:spacing w:after="0"/>
             </w:pPr>
           </w:p>
         </w:tc>
@@ -38469,8 +38400,7 @@
           </w:tcPr>
           <w:p>
             <w:pPr>
-              <w:keepLines/>
-              <w:spacing w:after="0" w:before="0" w:line="276" w:lineRule="auto"/>
+              <w:spacing w:after="0"/>
             </w:pPr>
           </w:p>
         </w:tc>
@@ -38548,8 +38478,7 @@
           </w:tcPr>
           <w:p>
             <w:pPr>
-              <w:keepLines/>
-              <w:spacing w:after="0" w:before="0" w:line="276" w:lineRule="auto"/>
+              <w:spacing w:after="0"/>
             </w:pPr>
           </w:p>
         </w:tc>
@@ -38627,8 +38556,7 @@
           </w:tcPr>
           <w:p>
             <w:pPr>
-              <w:keepLines/>
-              <w:spacing w:after="0" w:before="0" w:line="276" w:lineRule="auto"/>
+              <w:spacing w:after="0"/>
             </w:pPr>
           </w:p>
         </w:tc>
@@ -38706,8 +38634,7 @@
           </w:tcPr>
           <w:p>
             <w:pPr>
-              <w:keepLines/>
-              <w:spacing w:after="0" w:before="0" w:line="276" w:lineRule="auto"/>
+              <w:spacing w:after="0"/>
             </w:pPr>
           </w:p>
         </w:tc>
@@ -38812,8 +38739,7 @@
           </w:tcPr>
           <w:p>
             <w:pPr>
-              <w:keepLines/>
-              <w:spacing w:after="0" w:before="0" w:line="276" w:lineRule="auto"/>
+              <w:spacing w:after="0"/>
             </w:pPr>
           </w:p>
         </w:tc>
@@ -38908,8 +38834,7 @@
           </w:tcPr>
           <w:p>
             <w:pPr>
-              <w:keepLines/>
-              <w:spacing w:after="0" w:before="0" w:line="276" w:lineRule="auto"/>
+              <w:spacing w:after="0"/>
             </w:pPr>
           </w:p>
         </w:tc>
@@ -38987,8 +38912,7 @@
           </w:tcPr>
           <w:p>
             <w:pPr>
-              <w:keepLines/>
-              <w:spacing w:after="0" w:before="0" w:line="276" w:lineRule="auto"/>
+              <w:spacing w:after="0"/>
             </w:pPr>
           </w:p>
         </w:tc>
@@ -39066,8 +38990,7 @@
           </w:tcPr>
           <w:p>
             <w:pPr>
-              <w:keepLines/>
-              <w:spacing w:after="0" w:before="0" w:line="276" w:lineRule="auto"/>
+              <w:spacing w:after="0"/>
             </w:pPr>
           </w:p>
         </w:tc>
@@ -39145,8 +39068,7 @@
           </w:tcPr>
           <w:p>
             <w:pPr>
-              <w:keepLines/>
-              <w:spacing w:after="0" w:before="0" w:line="276" w:lineRule="auto"/>
+              <w:spacing w:after="0"/>
             </w:pPr>
           </w:p>
         </w:tc>
@@ -39262,8 +39184,7 @@
           <w:p>
             <w:pPr>
               <w:keepNext/>
-              <w:keepLines/>
-              <w:spacing w:after="120" w:before="0" w:line="276" w:lineRule="auto"/>
+              <w:spacing w:after="0"/>
             </w:pPr>
           </w:p>
         </w:tc>
@@ -39331,8 +39252,7 @@
           <w:p>
             <w:pPr>
               <w:keepNext/>
-              <w:keepLines/>
-              <w:spacing w:after="120" w:before="0" w:line="276" w:lineRule="auto"/>
+              <w:spacing w:after="0"/>
             </w:pPr>
           </w:p>
         </w:tc>
@@ -39400,8 +39320,7 @@
           <w:p>
             <w:pPr>
               <w:keepNext/>
-              <w:keepLines/>
-              <w:spacing w:after="120" w:before="0" w:line="276" w:lineRule="auto"/>
+              <w:spacing w:after="0"/>
             </w:pPr>
           </w:p>
         </w:tc>
@@ -39496,8 +39415,7 @@
           </w:tcPr>
           <w:p>
             <w:pPr>
-              <w:keepLines/>
-              <w:spacing w:after="0" w:before="0" w:line="276" w:lineRule="auto"/>
+              <w:spacing w:after="0"/>
             </w:pPr>
           </w:p>
         </w:tc>
@@ -39575,8 +39493,7 @@
           </w:tcPr>
           <w:p>
             <w:pPr>
-              <w:keepLines/>
-              <w:spacing w:after="0" w:before="0" w:line="276" w:lineRule="auto"/>
+              <w:spacing w:after="0"/>
             </w:pPr>
           </w:p>
         </w:tc>
@@ -39654,8 +39571,7 @@
           </w:tcPr>
           <w:p>
             <w:pPr>
-              <w:keepLines/>
-              <w:spacing w:after="0" w:before="0" w:line="276" w:lineRule="auto"/>
+              <w:spacing w:after="0"/>
             </w:pPr>
           </w:p>
         </w:tc>
@@ -39733,8 +39649,7 @@
           </w:tcPr>
           <w:p>
             <w:pPr>
-              <w:keepLines/>
-              <w:spacing w:after="0" w:before="0" w:line="276" w:lineRule="auto"/>
+              <w:spacing w:after="0"/>
             </w:pPr>
           </w:p>
         </w:tc>
@@ -39767,7 +39682,7 @@
           <w:sz w:val="19"/>
           <w:szCs w:val="19"/>
         </w:rPr>
-        <w:t xml:space="preserve">De 0 a 10, qual é a sua disponibilidade para alterar processos da sua área se os dados demonstrarem que o modelo actual não está a funcionar? (circule)</w:t>
+        <w:t xml:space="preserve">De 0 a 10, qual é a sua disponibilidade para alterar processos da sua área se os dados demonstrarem que o modelo actual não está a funcionar? (assinale)</w:t>
       </w:r>
     </w:p>
     <w:tbl>
@@ -39812,17 +39727,16 @@
             </w:tcBorders>
             <w:shd w:fill="FFFFFF" w:color="auto" w:val="clear"/>
             <w:tcMar>
-              <w:top w:type="dxa" w:w="90"/>
-              <w:left w:type="dxa" w:w="140"/>
-              <w:bottom w:type="dxa" w:w="90"/>
-              <w:right w:type="dxa" w:w="140"/>
+              <w:top w:type="dxa" w:w="60"/>
+              <w:left w:type="dxa" w:w="30"/>
+              <w:bottom w:type="dxa" w:w="60"/>
+              <w:right w:type="dxa" w:w="30"/>
             </w:tcMar>
             <w:vAlign w:val="center"/>
           </w:tcPr>
           <w:p>
             <w:pPr>
-              <w:keepLines/>
-              <w:spacing w:after="0" w:before="0" w:line="276" w:lineRule="auto"/>
+              <w:spacing w:after="0"/>
               <w:jc w:val="center"/>
             </w:pPr>
             <w:r>
@@ -39849,17 +39763,16 @@
             </w:tcBorders>
             <w:shd w:fill="F7F8FD" w:color="auto" w:val="clear"/>
             <w:tcMar>
-              <w:top w:type="dxa" w:w="90"/>
-              <w:left w:type="dxa" w:w="140"/>
-              <w:bottom w:type="dxa" w:w="90"/>
-              <w:right w:type="dxa" w:w="140"/>
+              <w:top w:type="dxa" w:w="60"/>
+              <w:left w:type="dxa" w:w="30"/>
+              <w:bottom w:type="dxa" w:w="60"/>
+              <w:right w:type="dxa" w:w="30"/>
             </w:tcMar>
             <w:vAlign w:val="center"/>
           </w:tcPr>
           <w:p>
             <w:pPr>
-              <w:keepLines/>
-              <w:spacing w:after="0" w:before="0" w:line="276" w:lineRule="auto"/>
+              <w:spacing w:after="0"/>
               <w:jc w:val="center"/>
             </w:pPr>
             <w:r>
@@ -39886,17 +39799,16 @@
             </w:tcBorders>
             <w:shd w:fill="FFFFFF" w:color="auto" w:val="clear"/>
             <w:tcMar>
-              <w:top w:type="dxa" w:w="90"/>
-              <w:left w:type="dxa" w:w="140"/>
-              <w:bottom w:type="dxa" w:w="90"/>
-              <w:right w:type="dxa" w:w="140"/>
+              <w:top w:type="dxa" w:w="60"/>
+              <w:left w:type="dxa" w:w="30"/>
+              <w:bottom w:type="dxa" w:w="60"/>
+              <w:right w:type="dxa" w:w="30"/>
             </w:tcMar>
             <w:vAlign w:val="center"/>
           </w:tcPr>
           <w:p>
             <w:pPr>
-              <w:keepLines/>
-              <w:spacing w:after="0" w:before="0" w:line="276" w:lineRule="auto"/>
+              <w:spacing w:after="0"/>
               <w:jc w:val="center"/>
             </w:pPr>
             <w:r>
@@ -39923,17 +39835,16 @@
             </w:tcBorders>
             <w:shd w:fill="F7F8FD" w:color="auto" w:val="clear"/>
             <w:tcMar>
-              <w:top w:type="dxa" w:w="90"/>
-              <w:left w:type="dxa" w:w="140"/>
-              <w:bottom w:type="dxa" w:w="90"/>
-              <w:right w:type="dxa" w:w="140"/>
+              <w:top w:type="dxa" w:w="60"/>
+              <w:left w:type="dxa" w:w="30"/>
+              <w:bottom w:type="dxa" w:w="60"/>
+              <w:right w:type="dxa" w:w="30"/>
             </w:tcMar>
             <w:vAlign w:val="center"/>
           </w:tcPr>
           <w:p>
             <w:pPr>
-              <w:keepLines/>
-              <w:spacing w:after="0" w:before="0" w:line="276" w:lineRule="auto"/>
+              <w:spacing w:after="0"/>
               <w:jc w:val="center"/>
             </w:pPr>
             <w:r>
@@ -39960,17 +39871,16 @@
             </w:tcBorders>
             <w:shd w:fill="FFFFFF" w:color="auto" w:val="clear"/>
             <w:tcMar>
-              <w:top w:type="dxa" w:w="90"/>
-              <w:left w:type="dxa" w:w="140"/>
-              <w:bottom w:type="dxa" w:w="90"/>
-              <w:right w:type="dxa" w:w="140"/>
+              <w:top w:type="dxa" w:w="60"/>
+              <w:left w:type="dxa" w:w="30"/>
+              <w:bottom w:type="dxa" w:w="60"/>
+              <w:right w:type="dxa" w:w="30"/>
             </w:tcMar>
             <w:vAlign w:val="center"/>
           </w:tcPr>
           <w:p>
             <w:pPr>
-              <w:keepLines/>
-              <w:spacing w:after="0" w:before="0" w:line="276" w:lineRule="auto"/>
+              <w:spacing w:after="0"/>
               <w:jc w:val="center"/>
             </w:pPr>
             <w:r>
@@ -39997,17 +39907,16 @@
             </w:tcBorders>
             <w:shd w:fill="F7F8FD" w:color="auto" w:val="clear"/>
             <w:tcMar>
-              <w:top w:type="dxa" w:w="90"/>
-              <w:left w:type="dxa" w:w="140"/>
-              <w:bottom w:type="dxa" w:w="90"/>
-              <w:right w:type="dxa" w:w="140"/>
+              <w:top w:type="dxa" w:w="60"/>
+              <w:left w:type="dxa" w:w="30"/>
+              <w:bottom w:type="dxa" w:w="60"/>
+              <w:right w:type="dxa" w:w="30"/>
             </w:tcMar>
             <w:vAlign w:val="center"/>
           </w:tcPr>
           <w:p>
             <w:pPr>
-              <w:keepLines/>
-              <w:spacing w:after="0" w:before="0" w:line="276" w:lineRule="auto"/>
+              <w:spacing w:after="0"/>
               <w:jc w:val="center"/>
             </w:pPr>
             <w:r>
@@ -40034,17 +39943,16 @@
             </w:tcBorders>
             <w:shd w:fill="FFFFFF" w:color="auto" w:val="clear"/>
             <w:tcMar>
-              <w:top w:type="dxa" w:w="90"/>
-              <w:left w:type="dxa" w:w="140"/>
-              <w:bottom w:type="dxa" w:w="90"/>
-              <w:right w:type="dxa" w:w="140"/>
+              <w:top w:type="dxa" w:w="60"/>
+              <w:left w:type="dxa" w:w="30"/>
+              <w:bottom w:type="dxa" w:w="60"/>
+              <w:right w:type="dxa" w:w="30"/>
             </w:tcMar>
             <w:vAlign w:val="center"/>
           </w:tcPr>
           <w:p>
             <w:pPr>
-              <w:keepLines/>
-              <w:spacing w:after="0" w:before="0" w:line="276" w:lineRule="auto"/>
+              <w:spacing w:after="0"/>
               <w:jc w:val="center"/>
             </w:pPr>
             <w:r>
@@ -40071,17 +39979,16 @@
             </w:tcBorders>
             <w:shd w:fill="F7F8FD" w:color="auto" w:val="clear"/>
             <w:tcMar>
-              <w:top w:type="dxa" w:w="90"/>
-              <w:left w:type="dxa" w:w="140"/>
-              <w:bottom w:type="dxa" w:w="90"/>
-              <w:right w:type="dxa" w:w="140"/>
+              <w:top w:type="dxa" w:w="60"/>
+              <w:left w:type="dxa" w:w="30"/>
+              <w:bottom w:type="dxa" w:w="60"/>
+              <w:right w:type="dxa" w:w="30"/>
             </w:tcMar>
             <w:vAlign w:val="center"/>
           </w:tcPr>
           <w:p>
             <w:pPr>
-              <w:keepLines/>
-              <w:spacing w:after="0" w:before="0" w:line="276" w:lineRule="auto"/>
+              <w:spacing w:after="0"/>
               <w:jc w:val="center"/>
             </w:pPr>
             <w:r>
@@ -40108,17 +40015,16 @@
             </w:tcBorders>
             <w:shd w:fill="FFFFFF" w:color="auto" w:val="clear"/>
             <w:tcMar>
-              <w:top w:type="dxa" w:w="90"/>
-              <w:left w:type="dxa" w:w="140"/>
-              <w:bottom w:type="dxa" w:w="90"/>
-              <w:right w:type="dxa" w:w="140"/>
+              <w:top w:type="dxa" w:w="60"/>
+              <w:left w:type="dxa" w:w="30"/>
+              <w:bottom w:type="dxa" w:w="60"/>
+              <w:right w:type="dxa" w:w="30"/>
             </w:tcMar>
             <w:vAlign w:val="center"/>
           </w:tcPr>
           <w:p>
             <w:pPr>
-              <w:keepLines/>
-              <w:spacing w:after="0" w:before="0" w:line="276" w:lineRule="auto"/>
+              <w:spacing w:after="0"/>
               <w:jc w:val="center"/>
             </w:pPr>
             <w:r>
@@ -40145,17 +40051,16 @@
             </w:tcBorders>
             <w:shd w:fill="F7F8FD" w:color="auto" w:val="clear"/>
             <w:tcMar>
-              <w:top w:type="dxa" w:w="90"/>
-              <w:left w:type="dxa" w:w="140"/>
-              <w:bottom w:type="dxa" w:w="90"/>
-              <w:right w:type="dxa" w:w="140"/>
+              <w:top w:type="dxa" w:w="60"/>
+              <w:left w:type="dxa" w:w="30"/>
+              <w:bottom w:type="dxa" w:w="60"/>
+              <w:right w:type="dxa" w:w="30"/>
             </w:tcMar>
             <w:vAlign w:val="center"/>
           </w:tcPr>
           <w:p>
             <w:pPr>
-              <w:keepLines/>
-              <w:spacing w:after="0" w:before="0" w:line="276" w:lineRule="auto"/>
+              <w:spacing w:after="0"/>
               <w:jc w:val="center"/>
             </w:pPr>
             <w:r>
@@ -40182,17 +40087,16 @@
             </w:tcBorders>
             <w:shd w:fill="FFFFFF" w:color="auto" w:val="clear"/>
             <w:tcMar>
-              <w:top w:type="dxa" w:w="90"/>
-              <w:left w:type="dxa" w:w="140"/>
-              <w:bottom w:type="dxa" w:w="90"/>
-              <w:right w:type="dxa" w:w="140"/>
+              <w:top w:type="dxa" w:w="60"/>
+              <w:left w:type="dxa" w:w="30"/>
+              <w:bottom w:type="dxa" w:w="60"/>
+              <w:right w:type="dxa" w:w="30"/>
             </w:tcMar>
             <w:vAlign w:val="center"/>
           </w:tcPr>
           <w:p>
             <w:pPr>
-              <w:keepLines/>
-              <w:spacing w:after="0" w:before="0" w:line="276" w:lineRule="auto"/>
+              <w:spacing w:after="0"/>
               <w:jc w:val="center"/>
             </w:pPr>
             <w:r>
@@ -40299,8 +40203,7 @@
           </w:tcPr>
           <w:p>
             <w:pPr>
-              <w:keepLines/>
-              <w:spacing w:after="0" w:before="0" w:line="276" w:lineRule="auto"/>
+              <w:spacing w:after="0"/>
             </w:pPr>
           </w:p>
         </w:tc>
@@ -40378,8 +40281,7 @@
           </w:tcPr>
           <w:p>
             <w:pPr>
-              <w:keepLines/>
-              <w:spacing w:after="0" w:before="0" w:line="276" w:lineRule="auto"/>
+              <w:spacing w:after="0"/>
             </w:pPr>
           </w:p>
         </w:tc>
@@ -40805,8 +40707,7 @@
                 </w:tcPr>
                 <w:p>
                   <w:pPr>
-                    <w:keepLines/>
-                    <w:spacing w:after="0" w:before="0" w:line="276" w:lineRule="auto"/>
+                    <w:spacing w:after="0"/>
                   </w:pPr>
                 </w:p>
               </w:tc>
@@ -46643,8 +46544,7 @@
           </w:p>
           <w:p>
             <w:pPr>
-              <w:keepLines/>
-              <w:spacing w:after="200" w:before="0" w:line="276" w:lineRule="auto"/>
+              <w:spacing w:after="200" w:before="0"/>
             </w:pPr>
             <w:r>
               <w:rPr>
@@ -46653,14 +46553,8 @@
                 <w:sz w:val="18"/>
                 <w:szCs w:val="18"/>
               </w:rPr>
-              <w:t xml:space="preserve">Nome: ______________________________</w:t>
-            </w:r>
-          </w:p>
-          <w:p>
-            <w:pPr>
-              <w:keepLines/>
-              <w:spacing w:after="200" w:before="0" w:line="276" w:lineRule="auto"/>
-            </w:pPr>
+              <w:t xml:space="preserve">Nome: </w:t>
+            </w:r>
             <w:r>
               <w:rPr>
                 <w:rFonts w:ascii="Google Sans" w:cs="Google Sans" w:eastAsia="Google Sans" w:hAnsi="Google Sans"/>
@@ -46668,13 +46562,12 @@
                 <w:sz w:val="18"/>
                 <w:szCs w:val="18"/>
               </w:rPr>
-              <w:t xml:space="preserve">Cargo: ______________________________</w:t>
-            </w:r>
-          </w:p>
-          <w:p>
-            <w:pPr>
-              <w:keepLines/>
-              <w:spacing w:after="200" w:before="0" w:line="276" w:lineRule="auto"/>
+              <w:t xml:space="preserve">______________________________</w:t>
+            </w:r>
+          </w:p>
+          <w:p>
+            <w:pPr>
+              <w:spacing w:after="200" w:before="0"/>
             </w:pPr>
             <w:r>
               <w:rPr>
@@ -46683,14 +46576,8 @@
                 <w:sz w:val="18"/>
                 <w:szCs w:val="18"/>
               </w:rPr>
-              <w:t xml:space="preserve">Assinatura: ______________________________</w:t>
-            </w:r>
-          </w:p>
-          <w:p>
-            <w:pPr>
-              <w:keepLines/>
-              <w:spacing w:after="200" w:before="0" w:line="276" w:lineRule="auto"/>
-            </w:pPr>
+              <w:t xml:space="preserve">Cargo: </w:t>
+            </w:r>
             <w:r>
               <w:rPr>
                 <w:rFonts w:ascii="Google Sans" w:cs="Google Sans" w:eastAsia="Google Sans" w:hAnsi="Google Sans"/>
@@ -46698,7 +46585,53 @@
                 <w:sz w:val="18"/>
                 <w:szCs w:val="18"/>
               </w:rPr>
-              <w:t xml:space="preserve">Data: ______________________________</w:t>
+              <w:t xml:space="preserve">______________________________</w:t>
+            </w:r>
+          </w:p>
+          <w:p>
+            <w:pPr>
+              <w:spacing w:after="200" w:before="0"/>
+            </w:pPr>
+            <w:r>
+              <w:rPr>
+                <w:rFonts w:ascii="Google Sans" w:cs="Google Sans" w:eastAsia="Google Sans" w:hAnsi="Google Sans"/>
+                <w:color w:val="5B6384"/>
+                <w:sz w:val="18"/>
+                <w:szCs w:val="18"/>
+              </w:rPr>
+              <w:t xml:space="preserve">Assinatura: </w:t>
+            </w:r>
+            <w:r>
+              <w:rPr>
+                <w:rFonts w:ascii="Google Sans" w:cs="Google Sans" w:eastAsia="Google Sans" w:hAnsi="Google Sans"/>
+                <w:color w:val="5B6384"/>
+                <w:sz w:val="18"/>
+                <w:szCs w:val="18"/>
+              </w:rPr>
+              <w:t xml:space="preserve">______________________________</w:t>
+            </w:r>
+          </w:p>
+          <w:p>
+            <w:pPr>
+              <w:spacing w:after="200" w:before="0"/>
+            </w:pPr>
+            <w:r>
+              <w:rPr>
+                <w:rFonts w:ascii="Google Sans" w:cs="Google Sans" w:eastAsia="Google Sans" w:hAnsi="Google Sans"/>
+                <w:color w:val="5B6384"/>
+                <w:sz w:val="18"/>
+                <w:szCs w:val="18"/>
+              </w:rPr>
+              <w:t xml:space="preserve">Data: </w:t>
+            </w:r>
+            <w:r>
+              <w:rPr>
+                <w:rFonts w:ascii="Google Sans" w:cs="Google Sans" w:eastAsia="Google Sans" w:hAnsi="Google Sans"/>
+                <w:color w:val="5B6384"/>
+                <w:sz w:val="18"/>
+                <w:szCs w:val="18"/>
+              </w:rPr>
+              <w:t xml:space="preserve">______________________________</w:t>
             </w:r>
           </w:p>
         </w:tc>
@@ -46763,8 +46696,7 @@
           </w:p>
           <w:p>
             <w:pPr>
-              <w:keepLines/>
-              <w:spacing w:after="200" w:before="0" w:line="276" w:lineRule="auto"/>
+              <w:spacing w:after="200" w:before="0"/>
             </w:pPr>
             <w:r>
               <w:rPr>
@@ -46773,14 +46705,8 @@
                 <w:sz w:val="18"/>
                 <w:szCs w:val="18"/>
               </w:rPr>
-              <w:t xml:space="preserve">Nome: ______________________________</w:t>
-            </w:r>
-          </w:p>
-          <w:p>
-            <w:pPr>
-              <w:keepLines/>
-              <w:spacing w:after="200" w:before="0" w:line="276" w:lineRule="auto"/>
-            </w:pPr>
+              <w:t xml:space="preserve">Nome: </w:t>
+            </w:r>
             <w:r>
               <w:rPr>
                 <w:rFonts w:ascii="Google Sans" w:cs="Google Sans" w:eastAsia="Google Sans" w:hAnsi="Google Sans"/>
@@ -46788,13 +46714,12 @@
                 <w:sz w:val="18"/>
                 <w:szCs w:val="18"/>
               </w:rPr>
-              <w:t xml:space="preserve">Cargo: ______________________________</w:t>
-            </w:r>
-          </w:p>
-          <w:p>
-            <w:pPr>
-              <w:keepLines/>
-              <w:spacing w:after="200" w:before="0" w:line="276" w:lineRule="auto"/>
+              <w:t xml:space="preserve">______________________________</w:t>
+            </w:r>
+          </w:p>
+          <w:p>
+            <w:pPr>
+              <w:spacing w:after="200" w:before="0"/>
             </w:pPr>
             <w:r>
               <w:rPr>
@@ -46803,14 +46728,8 @@
                 <w:sz w:val="18"/>
                 <w:szCs w:val="18"/>
               </w:rPr>
-              <w:t xml:space="preserve">Assinatura: ______________________________</w:t>
-            </w:r>
-          </w:p>
-          <w:p>
-            <w:pPr>
-              <w:keepLines/>
-              <w:spacing w:after="200" w:before="0" w:line="276" w:lineRule="auto"/>
-            </w:pPr>
+              <w:t xml:space="preserve">Cargo: </w:t>
+            </w:r>
             <w:r>
               <w:rPr>
                 <w:rFonts w:ascii="Google Sans" w:cs="Google Sans" w:eastAsia="Google Sans" w:hAnsi="Google Sans"/>
@@ -46818,7 +46737,53 @@
                 <w:sz w:val="18"/>
                 <w:szCs w:val="18"/>
               </w:rPr>
-              <w:t xml:space="preserve">Data: ______________________________</w:t>
+              <w:t xml:space="preserve">______________________________</w:t>
+            </w:r>
+          </w:p>
+          <w:p>
+            <w:pPr>
+              <w:spacing w:after="200" w:before="0"/>
+            </w:pPr>
+            <w:r>
+              <w:rPr>
+                <w:rFonts w:ascii="Google Sans" w:cs="Google Sans" w:eastAsia="Google Sans" w:hAnsi="Google Sans"/>
+                <w:color w:val="5B6384"/>
+                <w:sz w:val="18"/>
+                <w:szCs w:val="18"/>
+              </w:rPr>
+              <w:t xml:space="preserve">Assinatura: </w:t>
+            </w:r>
+            <w:r>
+              <w:rPr>
+                <w:rFonts w:ascii="Google Sans" w:cs="Google Sans" w:eastAsia="Google Sans" w:hAnsi="Google Sans"/>
+                <w:color w:val="5B6384"/>
+                <w:sz w:val="18"/>
+                <w:szCs w:val="18"/>
+              </w:rPr>
+              <w:t xml:space="preserve">______________________________</w:t>
+            </w:r>
+          </w:p>
+          <w:p>
+            <w:pPr>
+              <w:spacing w:after="200" w:before="0"/>
+            </w:pPr>
+            <w:r>
+              <w:rPr>
+                <w:rFonts w:ascii="Google Sans" w:cs="Google Sans" w:eastAsia="Google Sans" w:hAnsi="Google Sans"/>
+                <w:color w:val="5B6384"/>
+                <w:sz w:val="18"/>
+                <w:szCs w:val="18"/>
+              </w:rPr>
+              <w:t xml:space="preserve">Data: </w:t>
+            </w:r>
+            <w:r>
+              <w:rPr>
+                <w:rFonts w:ascii="Google Sans" w:cs="Google Sans" w:eastAsia="Google Sans" w:hAnsi="Google Sans"/>
+                <w:color w:val="5B6384"/>
+                <w:sz w:val="18"/>
+                <w:szCs w:val="18"/>
+              </w:rPr>
+              <w:t xml:space="preserve">______________________________</w:t>
             </w:r>
           </w:p>
         </w:tc>

</xml_diff>